<commit_message>
Polish burnout review layout: heading font, repeating table header, figure placement
Co-Authored-By: Claude Opus 5.5 <noreply@anthropic.com>
Claude-Session: https://claude.ai/code/session_014QgqFT5Fkzz2mf4ivKRGXX
</commit_message>
<xml_diff>
--- a/downloads/Literature_Review_Burnout_Sleep_Recovery_Women.docx
+++ b/downloads/Literature_Review_Burnout_Sleep_Recovery_Women.docx
@@ -431,7 +431,7 @@
     </w:p>
     <w:p>
       <w:r>
-        <w:t>Women's cardiac autonomic profile also differs from men's. A meta-analysis of 172 studies (63 612 participants) found that women had a higher mean heart rate and lower overall HRV but greater vagally mediated (high-frequency) HRV.</w:t>
+        <w:t>Women's cardiac autonomic profile also differs from men's. A meta-analysis of 172 studies (63 612 participants) found that women had a higher mean heart rate and lower overall HRV but greater vagally mediated (high-frequency) HRV.</w:t>
       </w:r>
       <w:r>
         <w:rPr>
@@ -506,6 +506,9 @@
         <w:gridCol w:w="1872"/>
       </w:tblGrid>
       <w:tr>
+        <w:trPr>
+          <w:tblHeader w:val="true"/>
+        </w:trPr>
         <w:tc>
           <w:tcPr>
             <w:tcW w:type="dxa" w:w="1872"/>
@@ -707,7 +710,7 @@
               <w:rPr>
                 <w:sz w:val="18"/>
               </w:rPr>
-              <w:t>38 838 users, 31 days</w:t>
+              <w:t>38 838 users, 31 days</w:t>
             </w:r>
           </w:p>
         </w:tc>
@@ -1673,7 +1676,7 @@
               <w:rPr>
                 <w:sz w:val="18"/>
               </w:rPr>
-              <w:t>557 students, 255 736 nights</w:t>
+              <w:t>557 students, 255 736 nights</w:t>
             </w:r>
           </w:p>
         </w:tc>
@@ -1810,7 +1813,7 @@
         <w:t>WHOOP.</w:t>
       </w:r>
       <w:r>
-        <w:t xml:space="preserve"> In 38 838 WHOOP users who joined a 31-day program of four habits (morning light, a time-restricted eating window, moderate aerobic training, and breathing exercises), sleep consistency, resting heart rate, and HRV improved compared with matched nonparticipants, and improved sleep consistency partly explained the HRV gains.</w:t>
+        <w:t xml:space="preserve"> In 38 838 WHOOP users who joined a 31-day program of four habits (morning light, a time-restricted eating window, moderate aerobic training, and breathing exercises), sleep consistency, resting heart rate, and HRV improved compared with matched nonparticipants, and improved sleep consistency partly explained the HRV gains.</w:t>
       </w:r>
       <w:r>
         <w:rPr>
@@ -1977,12 +1980,16 @@
       </w:r>
     </w:p>
     <w:p>
+      <w:pPr>
+        <w:keepNext/>
+      </w:pPr>
       <w:r>
         <w:t>Figure 1 summarizes the relationships suggested by this literature and the questions that remain untested.</w:t>
       </w:r>
     </w:p>
     <w:p>
       <w:pPr>
+        <w:keepNext/>
         <w:jc w:val="center"/>
       </w:pPr>
       <w:r>
@@ -3926,7 +3933,7 @@
       <w:outlineLvl w:val="0"/>
     </w:pPr>
     <w:rPr>
-      <w:rFonts w:asciiTheme="majorHAnsi" w:eastAsiaTheme="majorEastAsia" w:hAnsiTheme="majorHAnsi" w:cstheme="majorBidi" w:ascii="Times New Roman" w:hAnsi="Times New Roman" w:eastAsia="Times New Roman"/>
+      <w:rFonts w:ascii="Times New Roman" w:hAnsi="Times New Roman" w:eastAsia="Times New Roman" w:cs="Times New Roman"/>
       <w:b/>
       <w:bCs/>
       <w:color w:val="000000"/>
@@ -3950,7 +3957,7 @@
       <w:outlineLvl w:val="1"/>
     </w:pPr>
     <w:rPr>
-      <w:rFonts w:asciiTheme="majorHAnsi" w:eastAsiaTheme="majorEastAsia" w:hAnsiTheme="majorHAnsi" w:cstheme="majorBidi" w:ascii="Times New Roman" w:hAnsi="Times New Roman" w:eastAsia="Times New Roman"/>
+      <w:rFonts w:ascii="Times New Roman" w:hAnsi="Times New Roman" w:eastAsia="Times New Roman" w:cs="Times New Roman"/>
       <w:b/>
       <w:bCs/>
       <w:color w:val="000000"/>
@@ -4215,7 +4222,7 @@
       <w:contextualSpacing/>
     </w:pPr>
     <w:rPr>
-      <w:rFonts w:asciiTheme="majorHAnsi" w:eastAsiaTheme="majorEastAsia" w:hAnsiTheme="majorHAnsi" w:cstheme="majorBidi" w:ascii="Times New Roman" w:hAnsi="Times New Roman" w:eastAsia="Times New Roman"/>
+      <w:rFonts w:ascii="Times New Roman" w:hAnsi="Times New Roman" w:eastAsia="Times New Roman" w:cs="Times New Roman"/>
       <w:color w:val="000000"/>
       <w:spacing w:val="5"/>
       <w:kern w:val="28"/>

</xml_diff>

<commit_message>
Burnout review: cite WHO definition, remove preprints, add sleep efficiency and peer-reviewed device studies
All 47 journal references verified against PubMed by DOI.

Co-Authored-By: Claude Opus 5.5 <noreply@anthropic.com>
Claude-Session: https://claude.ai/code/session_014QgqFT5Fkzz2mf4ivKRGXX
</commit_message>
<xml_diff>
--- a/downloads/Literature_Review_Burnout_Sleep_Recovery_Women.docx
+++ b/downloads/Literature_Review_Burnout_Sleep_Recovery_Women.docx
@@ -42,22 +42,31 @@
     </w:p>
     <w:p>
       <w:r>
-        <w:t>Burnout is a response to prolonged work- or study-related stress, characterized mainly by exhaustion, together with cynicism and a reduced sense of efficacy. It affects both working adults and university students: between one-fifth and one-third of nursing students report academic burnout,</w:t>
+        <w:t>The World Health Organization defines burnout as a syndrome resulting from chronic workplace stress that has not been successfully managed, characterized by feelings of exhaustion, increased mental distance from or cynicism about one's job, and reduced professional efficacy.</w:t>
       </w:r>
       <w:r>
         <w:rPr>
           <w:vertAlign w:val="superscript"/>
         </w:rPr>
-        <w:t>1,2</w:t>
-      </w:r>
-      <w:r>
-        <w:t xml:space="preserve"> and women physicians appear more likely than men to experience burnout, particularly emotional exhaustion.</w:t>
+        <w:t>1</w:t>
+      </w:r>
+      <w:r>
+        <w:t xml:space="preserve"> Although this definition refers specifically to the occupational context, a parallel concept of academic burnout is widely studied in students: between one-fifth and one-third of nursing students report academic burnout,</w:t>
       </w:r>
       <w:r>
         <w:rPr>
           <w:vertAlign w:val="superscript"/>
         </w:rPr>
-        <w:t>3</w:t>
+        <w:t>2,3</w:t>
+      </w:r>
+      <w:r>
+        <w:t xml:space="preserve"> and women physicians appear more likely than men to experience burnout, particularly emotional exhaustion.</w:t>
+      </w:r>
+      <w:r>
+        <w:rPr>
+          <w:vertAlign w:val="superscript"/>
+        </w:rPr>
+        <w:t>4</w:t>
       </w:r>
       <w:r>
         <w:t xml:space="preserve"> Sleep and the body's capacity to recover overnight are plausible pathways linking chronic stress to poorer health, and both can now be measured passively every night with consumer wearable devices.</w:t>
@@ -78,7 +87,7 @@
     </w:p>
     <w:p>
       <w:r>
-        <w:t>I searched Europe PMC, which includes PubMed/MEDLINE records, for studies published between 2016 and 2026. Search terms combined burnout and stress (burnout, academic burnout, occupational stress) with sleep (sleep, insomnia, actigraphy, polysomnography), physiological recovery (heart rate variability, resting heart rate, recovery score, readiness score), populations (women, students, nurses, physicians), and devices (wearable, WHOOP, Fitbit, Oura, Apple Watch, Garmin). I prioritized systematic reviews, meta-analyses, longitudinal studies, and studies using wearable devices. Preprints were included only where peer-reviewed evidence was lacking and are identified as preprints in the text.</w:t>
+        <w:t>I searched Europe PMC, which includes PubMed/MEDLINE records, for studies published between 2016 and 2026. Search terms combined burnout and stress (burnout, academic burnout, occupational stress) with sleep (sleep, insomnia, actigraphy, polysomnography), physiological recovery (heart rate variability, resting heart rate, recovery score, readiness score), populations (women, students, nurses, physicians), and devices (wearable, WHOOP, Fitbit, Oura, Apple Watch, Garmin). I prioritized systematic reviews, meta-analyses, longitudinal studies, and studies using wearable devices, and I included only peer-reviewed studies.</w:t>
       </w:r>
     </w:p>
     <w:p>
@@ -97,21 +106,10 @@
         <w:rPr>
           <w:vertAlign w:val="superscript"/>
         </w:rPr>
-        <w:t>4</w:t>
+        <w:t>5</w:t>
       </w:r>
       <w:r>
         <w:t xml:space="preserve"> A similar pattern has been reported in students: among 476 medical students (66% women), poorer sleep quality was associated with higher academic burnout, partly through higher perceived stress.</w:t>
-      </w:r>
-      <w:r>
-        <w:rPr>
-          <w:vertAlign w:val="superscript"/>
-        </w:rPr>
-        <w:t>5</w:t>
-      </w:r>
-    </w:p>
-    <w:p>
-      <w:r>
-        <w:t>Longitudinal studies suggest that the relationship runs in both directions. In a Swedish population cohort followed for 3 years, burnout was among the strongest predictors of new-onset insomnia, and risk estimates were generally similar in men and women.</w:t>
       </w:r>
       <w:r>
         <w:rPr>
@@ -119,8 +117,10 @@
         </w:rPr>
         <w:t>6</w:t>
       </w:r>
-      <w:r>
-        <w:t xml:space="preserve"> Among 2474 Swedish nurses, high burnout symptoms early in their careers predicted more frequent sleep problems 11 to 15 years later, even after accounting for current burnout.</w:t>
+    </w:p>
+    <w:p>
+      <w:r>
+        <w:t>Longitudinal studies suggest that the relationship runs in both directions. In a Swedish population cohort followed for 3 years, burnout was among the strongest predictors of new-onset insomnia, and risk estimates were generally similar in men and women.</w:t>
       </w:r>
       <w:r>
         <w:rPr>
@@ -129,7 +129,7 @@
         <w:t>7</w:t>
       </w:r>
       <w:r>
-        <w:t xml:space="preserve"> In 520 nurses assessed 6 months apart, insomnia mediated the association between loneliness and burnout.</w:t>
+        <w:t xml:space="preserve"> Among 2474 Swedish nurses, high burnout symptoms early in their careers predicted more frequent sleep problems 11 to 15 years later, even after accounting for current burnout.</w:t>
       </w:r>
       <w:r>
         <w:rPr>
@@ -138,7 +138,7 @@
         <w:t>8</w:t>
       </w:r>
       <w:r>
-        <w:t xml:space="preserve"> At the daily level, a 7-day study of 72 employees using actigraphy found that poor sleep quality predicted next-day exhaustion rather than the reverse, and that this effect depended on employees' existing level of burnout.</w:t>
+        <w:t xml:space="preserve"> In 520 nurses assessed 6 months apart, insomnia mediated the association between loneliness and burnout.</w:t>
       </w:r>
       <w:r>
         <w:rPr>
@@ -146,10 +146,8 @@
         </w:rPr>
         <w:t>9</w:t>
       </w:r>
-    </w:p>
-    <w:p>
-      <w:r>
-        <w:t>Sleep consistency has received less attention than sleep duration or quality. In 2115 first-year physicians wearing Fitbit devices, shorter sleep and greater day-to-day variability in sleep duration and wake time predicted poorer next-day mood and more depressive symptoms.</w:t>
+      <w:r>
+        <w:t xml:space="preserve"> At the daily level, a 7-day study of 72 employees using actigraphy found that poor sleep quality predicted next-day exhaustion rather than the reverse, and that this effect depended on employees' existing level of burnout.</w:t>
       </w:r>
       <w:r>
         <w:rPr>
@@ -157,8 +155,37 @@
         </w:rPr>
         <w:t>10</w:t>
       </w:r>
-      <w:r>
-        <w:t xml:space="preserve"> Objective measures of sleep efficiency in nonclinical burnout remain scarce, and most of the evidence in this area relies on questionnaires.</w:t>
+    </w:p>
+    <w:p>
+      <w:r>
+        <w:t>Sleep consistency has received less attention than sleep duration or quality. In 2115 first-year physicians wearing Fitbit devices, shorter sleep and greater day-to-day variability in sleep duration and wake time predicted poorer next-day mood and more depressive symptoms.</w:t>
+      </w:r>
+      <w:r>
+        <w:rPr>
+          <w:vertAlign w:val="superscript"/>
+        </w:rPr>
+        <w:t>11</w:t>
+      </w:r>
+      <w:r>
+        <w:t xml:space="preserve"> Similarly, in 149 college students (59% women) monitored with actigraphy for 1 week, greater night-to-night variability in sleep duration was associated with higher perceived stress, whereas variability in sleep efficiency and sleep timing was not.</w:t>
+      </w:r>
+      <w:r>
+        <w:rPr>
+          <w:vertAlign w:val="superscript"/>
+        </w:rPr>
+        <w:t>12</w:t>
+      </w:r>
+      <w:r>
+        <w:t xml:space="preserve"> In 45 nurses wearing Oura rings for 30 days, those with burnout had more variable sleep than those without burnout.</w:t>
+      </w:r>
+      <w:r>
+        <w:rPr>
+          <w:vertAlign w:val="superscript"/>
+        </w:rPr>
+        <w:t>13</w:t>
+      </w:r>
+      <w:r>
+        <w:t xml:space="preserve"> Sleep efficiency itself has rarely been examined in relation to burnout, and most of the evidence on sleep quality in this area relies on questionnaires.</w:t>
       </w:r>
     </w:p>
     <w:p>
@@ -177,41 +204,12 @@
         <w:rPr>
           <w:vertAlign w:val="superscript"/>
         </w:rPr>
-        <w:t>11</w:t>
+        <w:t>14</w:t>
       </w:r>
     </w:p>
     <w:p>
       <w:r>
         <w:t>Evidence for burnout itself is strongest in clinical samples. Patients with clinical burnout (n = 54; 40 women) had lower HRV on nearly all measures than healthy individuals, whereas employees with high burnout scores who were still working did not differ from healthy controls.</w:t>
-      </w:r>
-      <w:r>
-        <w:rPr>
-          <w:vertAlign w:val="superscript"/>
-        </w:rPr>
-        <w:t>12</w:t>
-      </w:r>
-      <w:r>
-        <w:t xml:space="preserve"> In 410 adults from the Dresden Burnout Study, emotional exhaustion, but not cynicism or reduced personal accomplishment, was associated with lower RMSSD, and RMSSD tracked exhaustion-related symptoms more closely than depressed mood.</w:t>
-      </w:r>
-      <w:r>
-        <w:rPr>
-          <w:vertAlign w:val="superscript"/>
-        </w:rPr>
-        <w:t>13</w:t>
-      </w:r>
-      <w:r>
-        <w:t xml:space="preserve"> In inpatients with burnout (n = 153; 88 women), associations between burnout severity and HRV were nonlinear and appeared only under specific recording conditions.</w:t>
-      </w:r>
-      <w:r>
-        <w:rPr>
-          <w:vertAlign w:val="superscript"/>
-        </w:rPr>
-        <w:t>14</w:t>
-      </w:r>
-    </w:p>
-    <w:p>
-      <w:r>
-        <w:t>Night-time recovery, the measure most relevant to wearable devices, has rarely been studied. In 202 employees with 24-hour electrocardiogram recordings, HRV differed by burnout risk across the whole day and during the daytime, but not at night; associations were weak and largely explained by age and gender.</w:t>
       </w:r>
       <w:r>
         <w:rPr>
@@ -220,13 +218,42 @@
         <w:t>15</w:t>
       </w:r>
       <w:r>
-        <w:t xml:space="preserve"> Resting heart rate may be more sensitive to change over time: in 49 medical faculty leaders (67% women) wearing Fitbit devices, sleeping heart rate rose by approximately 1.4 beats per minute over 15 weeks in a wait-list group but not in participants who completed a wellness course.</w:t>
+        <w:t xml:space="preserve"> In 410 adults from the Dresden Burnout Study, emotional exhaustion, but not cynicism or reduced personal accomplishment, was associated with lower RMSSD, and RMSSD tracked exhaustion-related symptoms more closely than depressed mood.</w:t>
       </w:r>
       <w:r>
         <w:rPr>
           <w:vertAlign w:val="superscript"/>
         </w:rPr>
         <w:t>16</w:t>
+      </w:r>
+      <w:r>
+        <w:t xml:space="preserve"> In inpatients with burnout (n = 153; 88 women), associations between burnout severity and HRV were nonlinear and appeared only under specific recording conditions.</w:t>
+      </w:r>
+      <w:r>
+        <w:rPr>
+          <w:vertAlign w:val="superscript"/>
+        </w:rPr>
+        <w:t>17</w:t>
+      </w:r>
+    </w:p>
+    <w:p>
+      <w:r>
+        <w:t>Night-time recovery, the measure most relevant to wearable devices, has rarely been studied. In 202 employees with 24-hour electrocardiogram recordings, HRV differed by burnout risk across the whole day and during the daytime, but not at night; associations were weak and largely explained by age and gender.</w:t>
+      </w:r>
+      <w:r>
+        <w:rPr>
+          <w:vertAlign w:val="superscript"/>
+        </w:rPr>
+        <w:t>18</w:t>
+      </w:r>
+      <w:r>
+        <w:t xml:space="preserve"> Resting heart rate may be more sensitive to change over time: in 49 medical faculty leaders (67% women) wearing Fitbit devices, sleeping heart rate rose by approximately 1.4 beats per minute over 15 weeks in a wait-list group but not in participants who completed a wellness course.</w:t>
+      </w:r>
+      <w:r>
+        <w:rPr>
+          <w:vertAlign w:val="superscript"/>
+        </w:rPr>
+        <w:t>19</w:t>
       </w:r>
     </w:p>
     <w:p>
@@ -250,39 +277,10 @@
         <w:rPr>
           <w:vertAlign w:val="superscript"/>
         </w:rPr>
-        <w:t>17</w:t>
+        <w:t>20</w:t>
       </w:r>
       <w:r>
         <w:t xml:space="preserve"> In 112 adults wearing an electrocardiogram patch before, during, and for 1 month after a 6-day stay at a wellness center, HRV changed during the stay, but individual responses varied widely.</w:t>
-      </w:r>
-      <w:r>
-        <w:rPr>
-          <w:vertAlign w:val="superscript"/>
-        </w:rPr>
-        <w:t>18</w:t>
-      </w:r>
-      <w:r>
-        <w:t xml:space="preserve"> In 54 workers wearing a consumer wrist device, the association between weekly stress and heart rate weakened as a planned vacation approached.</w:t>
-      </w:r>
-      <w:r>
-        <w:rPr>
-          <w:vertAlign w:val="superscript"/>
-        </w:rPr>
-        <w:t>19</w:t>
-      </w:r>
-    </w:p>
-    <w:p>
-      <w:r>
-        <w:t>Comparable evidence in students comes mainly from adolescents. In 146 adolescents wearing actigraphs during the last week of a school term and the following 2-week vacation, stress was associated with longer sleep onset latency in both periods.</w:t>
-      </w:r>
-      <w:r>
-        <w:rPr>
-          <w:vertAlign w:val="superscript"/>
-        </w:rPr>
-        <w:t>20</w:t>
-      </w:r>
-      <w:r>
-        <w:t xml:space="preserve"> In 27 middle school students wearing wrist bands across a full school year, sleep and activity differed between school days, weekends, and winter and summer vacations.</w:t>
       </w:r>
       <w:r>
         <w:rPr>
@@ -291,13 +289,42 @@
         <w:t>21</w:t>
       </w:r>
       <w:r>
-        <w:t xml:space="preserve"> I did not identify any study that tested whether burnout reduces physiological recovery during breaks in university students or working women. The Recovery Experience Questionnaire, which measures psychological detachment and relaxation during time off, may help explain individual differences in recovery.</w:t>
+        <w:t xml:space="preserve"> In 54 workers wearing a consumer wrist device, the association between weekly stress and heart rate weakened as a planned vacation approached.</w:t>
       </w:r>
       <w:r>
         <w:rPr>
           <w:vertAlign w:val="superscript"/>
         </w:rPr>
         <w:t>22</w:t>
+      </w:r>
+    </w:p>
+    <w:p>
+      <w:r>
+        <w:t>Comparable evidence in students comes mainly from adolescents. In 146 adolescents wearing actigraphs during the last week of a school term and the following 2-week vacation, stress was associated with longer sleep onset latency in both periods.</w:t>
+      </w:r>
+      <w:r>
+        <w:rPr>
+          <w:vertAlign w:val="superscript"/>
+        </w:rPr>
+        <w:t>23</w:t>
+      </w:r>
+      <w:r>
+        <w:t xml:space="preserve"> In 27 middle school students wearing wrist bands across a full school year, sleep and activity differed between school days, weekends, and winter and summer vacations.</w:t>
+      </w:r>
+      <w:r>
+        <w:rPr>
+          <w:vertAlign w:val="superscript"/>
+        </w:rPr>
+        <w:t>24</w:t>
+      </w:r>
+      <w:r>
+        <w:t xml:space="preserve"> I did not identify any study that tested whether burnout reduces physiological recovery during breaks in university students or working women. The Recovery Experience Questionnaire, which measures psychological detachment and relaxation during time off, may help explain individual differences in recovery.</w:t>
+      </w:r>
+      <w:r>
+        <w:rPr>
+          <w:vertAlign w:val="superscript"/>
+        </w:rPr>
+        <w:t>25</w:t>
       </w:r>
     </w:p>
     <w:p>
@@ -316,7 +343,7 @@
         <w:rPr>
           <w:vertAlign w:val="superscript"/>
         </w:rPr>
-        <w:t>2</w:t>
+        <w:t>3</w:t>
       </w:r>
       <w:r>
         <w:t xml:space="preserve"> whereas a separate meta-analysis estimated a prevalence of 19%, reflecting differences in scales and cutoffs.</w:t>
@@ -325,44 +352,10 @@
         <w:rPr>
           <w:vertAlign w:val="superscript"/>
         </w:rPr>
-        <w:t>1</w:t>
+        <w:t>2</w:t>
       </w:r>
       <w:r>
         <w:t xml:space="preserve"> The student version of the Copenhagen Burnout Inventory showed good reliability (α = 0.96) in 635 university students, and its scores were inversely related to academic self-efficacy and grades.</w:t>
-      </w:r>
-      <w:r>
-        <w:rPr>
-          <w:vertAlign w:val="superscript"/>
-        </w:rPr>
-        <w:t>23</w:t>
-      </w:r>
-      <w:r>
-        <w:t xml:space="preserve"> Because its personal burnout items are identical in the work and student versions, it allows students and working adults to be compared directly.</w:t>
-      </w:r>
-    </w:p>
-    <w:p>
-      <w:r>
-        <w:t>Academic stress is also reflected in physiology and sleep. In 90 students (60 women) monitored around a final examination, HRV was lowest before and during the examination and highest afterward, and women had lower HRV than men.</w:t>
-      </w:r>
-      <w:r>
-        <w:rPr>
-          <w:vertAlign w:val="superscript"/>
-        </w:rPr>
-        <w:t>24</w:t>
-      </w:r>
-      <w:r>
-        <w:t xml:space="preserve"> In 61 undergraduates followed for 30 days, irregular sleepers had a circadian rhythm delayed by about 2.5 hours and poorer academic performance than regular sleepers.</w:t>
-      </w:r>
-      <w:r>
-        <w:rPr>
-          <w:vertAlign w:val="superscript"/>
-        </w:rPr>
-        <w:t>25</w:t>
-      </w:r>
-    </w:p>
-    <w:p>
-      <w:r>
-        <w:t>Wearable research in students has focused mainly on detecting short-term stress. A scoping review of 134 studies found that most relied on electrodermal activity, that about 80% of studies using existing datasets drew on a single dataset of only 15 participants, and that 28% did not report participants' sex.</w:t>
       </w:r>
       <w:r>
         <w:rPr>
@@ -371,7 +364,18 @@
         <w:t>26</w:t>
       </w:r>
       <w:r>
-        <w:t xml:space="preserve"> A newly published dataset of Mexican undergraduates followed across a semester with Fitbit Inspire 3 devices and daily stress ratings demonstrates that semester-long monitoring is feasible.</w:t>
+        <w:t xml:space="preserve"> Both the original and student versions of the Copenhagen Burnout Inventory include a six-item personal burnout scale that measures physical and psychological fatigue regardless of whether a person is working, which allows students and working adults to be compared on the same measure.</w:t>
+      </w:r>
+      <w:r>
+        <w:rPr>
+          <w:vertAlign w:val="superscript"/>
+        </w:rPr>
+        <w:t>26</w:t>
+      </w:r>
+    </w:p>
+    <w:p>
+      <w:r>
+        <w:t>Academic stress is also reflected in physiology and sleep. In 90 students (60 women) monitored around a final examination, HRV was lowest before and during the examination and highest afterward, and women had lower HRV than men.</w:t>
       </w:r>
       <w:r>
         <w:rPr>
@@ -380,13 +384,33 @@
         <w:t>27</w:t>
       </w:r>
       <w:r>
-        <w:t xml:space="preserve"> A systematic review of smartwatch studies in students, currently available as a preprint, found that burnout itself was rarely measured with a validated scale.</w:t>
+        <w:t xml:space="preserve"> In 61 undergraduates followed for 30 days, irregular sleepers had a circadian rhythm delayed by about 2.5 hours and poorer academic performance than regular sleepers.</w:t>
       </w:r>
       <w:r>
         <w:rPr>
           <w:vertAlign w:val="superscript"/>
         </w:rPr>
         <w:t>28</w:t>
+      </w:r>
+    </w:p>
+    <w:p>
+      <w:r>
+        <w:t>Wearable research in students has focused mainly on detecting short-term stress. A scoping review of 134 studies found that most relied on electrodermal activity, that about 80% of studies using existing datasets drew on a single dataset of only 15 participants, and that 28% did not report participants' sex.</w:t>
+      </w:r>
+      <w:r>
+        <w:rPr>
+          <w:vertAlign w:val="superscript"/>
+        </w:rPr>
+        <w:t>29</w:t>
+      </w:r>
+      <w:r>
+        <w:t xml:space="preserve"> A newly published dataset of Mexican undergraduates followed across a semester with Fitbit Inspire 3 devices and daily stress ratings demonstrates that semester-long monitoring is feasible.</w:t>
+      </w:r>
+      <w:r>
+        <w:rPr>
+          <w:vertAlign w:val="superscript"/>
+        </w:rPr>
+        <w:t>30</w:t>
       </w:r>
     </w:p>
     <w:p>
@@ -405,42 +429,10 @@
         <w:rPr>
           <w:vertAlign w:val="superscript"/>
         </w:rPr>
-        <w:t>3</w:t>
+        <w:t>4</w:t>
       </w:r>
       <w:r>
         <w:t xml:space="preserve"> In nurses, a meta-analysis of 78 studies found that gender was associated mainly with depersonalization, which was higher in men.</w:t>
-      </w:r>
-      <w:r>
-        <w:rPr>
-          <w:vertAlign w:val="superscript"/>
-        </w:rPr>
-        <w:t>29</w:t>
-      </w:r>
-      <w:r>
-        <w:t xml:space="preserve"> Because exhaustion is the dimension most closely linked to HRV,</w:t>
-      </w:r>
-      <w:r>
-        <w:rPr>
-          <w:vertAlign w:val="superscript"/>
-        </w:rPr>
-        <w:t>13</w:t>
-      </w:r>
-      <w:r>
-        <w:t xml:space="preserve"> it is an appropriate focus for research in women.</w:t>
-      </w:r>
-    </w:p>
-    <w:p>
-      <w:r>
-        <w:t>Women's cardiac autonomic profile also differs from men's. A meta-analysis of 172 studies (63 612 participants) found that women had a higher mean heart rate and lower overall HRV but greater vagally mediated (high-frequency) HRV.</w:t>
-      </w:r>
-      <w:r>
-        <w:rPr>
-          <w:vertAlign w:val="superscript"/>
-        </w:rPr>
-        <w:t>30</w:t>
-      </w:r>
-      <w:r>
-        <w:t xml:space="preserve"> HRV also changes across the menstrual cycle: a meta-analysis of 37 studies (1004 women) showed that vagal activity decreases from the follicular to the luteal phase (d = −0.39), with the largest decrease before menstruation.</w:t>
       </w:r>
       <w:r>
         <w:rPr>
@@ -449,7 +441,21 @@
         <w:t>31</w:t>
       </w:r>
       <w:r>
-        <w:t xml:space="preserve"> A living systematic review of 16 wearable studies reported that HRV was 3% to 9% higher early in the cycle than late in the cycle and that hormonal contraceptive users had lower HRV.</w:t>
+        <w:t xml:space="preserve"> Because exhaustion is the dimension most closely linked to HRV,</w:t>
+      </w:r>
+      <w:r>
+        <w:rPr>
+          <w:vertAlign w:val="superscript"/>
+        </w:rPr>
+        <w:t>16</w:t>
+      </w:r>
+      <w:r>
+        <w:t xml:space="preserve"> it is an appropriate focus for research in women.</w:t>
+      </w:r>
+    </w:p>
+    <w:p>
+      <w:r>
+        <w:t>Women's cardiac autonomic profile also differs from men's. A meta-analysis of 172 studies (63 612 participants) found that women had a higher mean heart rate and lower overall HRV but greater vagally mediated (high-frequency) HRV.</w:t>
       </w:r>
       <w:r>
         <w:rPr>
@@ -458,13 +464,31 @@
         <w:t>32</w:t>
       </w:r>
       <w:r>
-        <w:t xml:space="preserve"> In 26 healthy women wearing Oura rings across a full cycle, sleep did not vary by phase, whereas skin temperature and heart rate did.</w:t>
+        <w:t xml:space="preserve"> HRV also changes across the menstrual cycle: a meta-analysis of 37 studies (1004 women) showed that vagal activity decreases from the follicular to the luteal phase (d = −0.39), with the largest decrease before menstruation.</w:t>
       </w:r>
       <w:r>
         <w:rPr>
           <w:vertAlign w:val="superscript"/>
         </w:rPr>
         <w:t>33</w:t>
+      </w:r>
+      <w:r>
+        <w:t xml:space="preserve"> A living systematic review of 16 wearable studies reported that HRV was 3% to 9% higher early in the cycle than late in the cycle and that hormonal contraceptive users had lower HRV.</w:t>
+      </w:r>
+      <w:r>
+        <w:rPr>
+          <w:vertAlign w:val="superscript"/>
+        </w:rPr>
+        <w:t>34</w:t>
+      </w:r>
+      <w:r>
+        <w:t xml:space="preserve"> In 26 healthy women wearing Oura rings across a full cycle, sleep did not vary by phase, whereas skin temperature and heart rate did.</w:t>
+      </w:r>
+      <w:r>
+        <w:rPr>
+          <w:vertAlign w:val="superscript"/>
+        </w:rPr>
+        <w:t>35</w:t>
       </w:r>
       <w:r>
         <w:t xml:space="preserve"> These cyclical changes are similar in size to the burnout effects described above, so menstrual cycle phase and contraceptive use should be recorded in any study of women.</w:t>
@@ -603,7 +627,7 @@
                 <w:sz w:val="18"/>
                 <w:vertAlign w:val="superscript"/>
               </w:rPr>
-              <w:t>27</w:t>
+              <w:t>30</w:t>
             </w:r>
           </w:p>
         </w:tc>
@@ -682,7 +706,7 @@
                 <w:sz w:val="18"/>
                 <w:vertAlign w:val="superscript"/>
               </w:rPr>
-              <w:t>34</w:t>
+              <w:t>36</w:t>
             </w:r>
           </w:p>
         </w:tc>
@@ -754,20 +778,14 @@
               <w:rPr>
                 <w:sz w:val="18"/>
               </w:rPr>
-              <w:t>Pinkerton et al (2026)</w:t>
+              <w:t>Azadifar et al (2026)</w:t>
             </w:r>
             <w:r>
               <w:rPr>
                 <w:sz w:val="18"/>
                 <w:vertAlign w:val="superscript"/>
               </w:rPr>
-              <w:t>35</w:t>
-            </w:r>
-            <w:r>
-              <w:rPr>
-                <w:sz w:val="18"/>
-              </w:rPr>
-              <w:t>*</w:t>
+              <w:t>37</w:t>
             </w:r>
           </w:p>
         </w:tc>
@@ -795,7 +813,7 @@
               <w:rPr>
                 <w:sz w:val="18"/>
               </w:rPr>
-              <w:t>31 graduate students, 5 months</w:t>
+              <w:t>1290 adults aged 33-35 years, 2 weeks</w:t>
             </w:r>
           </w:p>
         </w:tc>
@@ -809,7 +827,7 @@
               <w:rPr>
                 <w:sz w:val="18"/>
               </w:rPr>
-              <w:t>Daily emotional distress</w:t>
+              <w:t>Depression and anxiety symptoms</w:t>
             </w:r>
           </w:p>
         </w:tc>
@@ -823,7 +841,7 @@
               <w:rPr>
                 <w:sz w:val="18"/>
               </w:rPr>
-              <w:t>High-distress days had lower overnight RMSSD</w:t>
+              <w:t>Symptomatic groups had higher heart rate, lower RMSSD during sleep, and less REM and deep sleep</w:t>
             </w:r>
           </w:p>
         </w:tc>
@@ -839,20 +857,14 @@
               <w:rPr>
                 <w:sz w:val="18"/>
               </w:rPr>
-              <w:t>Bloomfield et al (2025)</w:t>
+              <w:t>Bourassa et al (2026)</w:t>
             </w:r>
             <w:r>
               <w:rPr>
                 <w:sz w:val="18"/>
                 <w:vertAlign w:val="superscript"/>
               </w:rPr>
-              <w:t>36</w:t>
-            </w:r>
-            <w:r>
-              <w:rPr>
-                <w:sz w:val="18"/>
-              </w:rPr>
-              <w:t>*</w:t>
+              <w:t>13</w:t>
             </w:r>
           </w:p>
         </w:tc>
@@ -880,7 +892,7 @@
               <w:rPr>
                 <w:sz w:val="18"/>
               </w:rPr>
-              <w:t>379 first-year students (68% women), 14 weeks</w:t>
+              <w:t>45 nurses, 30 days</w:t>
             </w:r>
           </w:p>
         </w:tc>
@@ -894,7 +906,7 @@
               <w:rPr>
                 <w:sz w:val="18"/>
               </w:rPr>
-              <w:t>Stress, well-being</w:t>
+              <w:t>Burnout questionnaire</w:t>
             </w:r>
           </w:p>
         </w:tc>
@@ -908,7 +920,7 @@
               <w:rPr>
                 <w:sz w:val="18"/>
               </w:rPr>
-              <w:t>Nature-based intervention lowered stress and raised HRV</w:t>
+              <w:t>Burnout linked to more variable sleep; heart rate measures tracked changes in exhaustion</w:t>
             </w:r>
           </w:p>
         </w:tc>
@@ -931,7 +943,7 @@
                 <w:sz w:val="18"/>
                 <w:vertAlign w:val="superscript"/>
               </w:rPr>
-              <w:t>9</w:t>
+              <w:t>10</w:t>
             </w:r>
           </w:p>
         </w:tc>
@@ -1010,7 +1022,7 @@
                 <w:sz w:val="18"/>
                 <w:vertAlign w:val="superscript"/>
               </w:rPr>
-              <w:t>37</w:t>
+              <w:t>38</w:t>
             </w:r>
           </w:p>
         </w:tc>
@@ -1082,20 +1094,14 @@
               <w:rPr>
                 <w:sz w:val="18"/>
               </w:rPr>
-              <w:t>van der Mee et al (2025)</w:t>
+              <w:t>Norful et al (2025)</w:t>
             </w:r>
             <w:r>
               <w:rPr>
                 <w:sz w:val="18"/>
                 <w:vertAlign w:val="superscript"/>
               </w:rPr>
-              <w:t>38</w:t>
-            </w:r>
-            <w:r>
-              <w:rPr>
-                <w:sz w:val="18"/>
-              </w:rPr>
-              <w:t>*</w:t>
+              <w:t>39</w:t>
             </w:r>
           </w:p>
         </w:tc>
@@ -1109,7 +1115,7 @@
               <w:rPr>
                 <w:sz w:val="18"/>
               </w:rPr>
-              <w:t>Garmin</w:t>
+              <w:t>Oura Ring</w:t>
             </w:r>
           </w:p>
         </w:tc>
@@ -1123,7 +1129,7 @@
               <w:rPr>
                 <w:sz w:val="18"/>
               </w:rPr>
-              <w:t>95 students (80 women), 28 days</w:t>
+              <w:t>25 nurses (84% women), 8 weeks</w:t>
             </w:r>
           </w:p>
         </w:tc>
@@ -1137,7 +1143,7 @@
               <w:rPr>
                 <w:sz w:val="18"/>
               </w:rPr>
-              <w:t>Mood (5 times daily)</w:t>
+              <w:t>Sleep, stress, burnout</w:t>
             </w:r>
           </w:p>
         </w:tc>
@@ -1151,7 +1157,86 @@
               <w:rPr>
                 <w:sz w:val="18"/>
               </w:rPr>
-              <w:t>“Stress Score” tracked positive arousal, not negative mood</w:t>
+              <w:t>Sleep kit shortened self-reported sleep latency; no change in HRV</w:t>
+            </w:r>
+          </w:p>
+        </w:tc>
+      </w:tr>
+      <w:tr>
+        <w:tc>
+          <w:tcPr>
+            <w:tcW w:type="dxa" w:w="1872"/>
+          </w:tcPr>
+          <w:p>
+            <w:r/>
+            <w:r>
+              <w:rPr>
+                <w:sz w:val="18"/>
+              </w:rPr>
+              <w:t>Rosenbach et al (2025)</w:t>
+            </w:r>
+            <w:r>
+              <w:rPr>
+                <w:sz w:val="18"/>
+                <w:vertAlign w:val="superscript"/>
+              </w:rPr>
+              <w:t>40</w:t>
+            </w:r>
+          </w:p>
+        </w:tc>
+        <w:tc>
+          <w:tcPr>
+            <w:tcW w:type="dxa" w:w="1872"/>
+          </w:tcPr>
+          <w:p>
+            <w:r/>
+            <w:r>
+              <w:rPr>
+                <w:sz w:val="18"/>
+              </w:rPr>
+              <w:t>Garmin Vivosmart 4</w:t>
+            </w:r>
+          </w:p>
+        </w:tc>
+        <w:tc>
+          <w:tcPr>
+            <w:tcW w:type="dxa" w:w="1872"/>
+          </w:tcPr>
+          <w:p>
+            <w:r/>
+            <w:r>
+              <w:rPr>
+                <w:sz w:val="18"/>
+              </w:rPr>
+              <w:t>60 adults, laboratory session</w:t>
+            </w:r>
+          </w:p>
+        </w:tc>
+        <w:tc>
+          <w:tcPr>
+            <w:tcW w:type="dxa" w:w="1872"/>
+          </w:tcPr>
+          <w:p>
+            <w:r/>
+            <w:r>
+              <w:rPr>
+                <w:sz w:val="18"/>
+              </w:rPr>
+              <w:t>Self-reported stress</w:t>
+            </w:r>
+          </w:p>
+        </w:tc>
+        <w:tc>
+          <w:tcPr>
+            <w:tcW w:type="dxa" w:w="1872"/>
+          </w:tcPr>
+          <w:p>
+            <w:r/>
+            <w:r>
+              <w:rPr>
+                <w:sz w:val="18"/>
+              </w:rPr>
+              <w:t>Stress score correlated with heart rate and RMSSD but only marginally predicted self-reported stress</w:t>
             </w:r>
           </w:p>
         </w:tc>
@@ -1174,7 +1259,7 @@
                 <w:sz w:val="18"/>
                 <w:vertAlign w:val="superscript"/>
               </w:rPr>
-              <w:t>39</w:t>
+              <w:t>41</w:t>
             </w:r>
           </w:p>
         </w:tc>
@@ -1253,7 +1338,7 @@
                 <w:sz w:val="18"/>
                 <w:vertAlign w:val="superscript"/>
               </w:rPr>
-              <w:t>40</w:t>
+              <w:t>42</w:t>
             </w:r>
           </w:p>
         </w:tc>
@@ -1332,7 +1417,7 @@
                 <w:sz w:val="18"/>
                 <w:vertAlign w:val="superscript"/>
               </w:rPr>
-              <w:t>16</w:t>
+              <w:t>19</w:t>
             </w:r>
           </w:p>
         </w:tc>
@@ -1411,7 +1496,7 @@
                 <w:sz w:val="18"/>
                 <w:vertAlign w:val="superscript"/>
               </w:rPr>
-              <w:t>41</w:t>
+              <w:t>43</w:t>
             </w:r>
           </w:p>
         </w:tc>
@@ -1490,7 +1575,7 @@
                 <w:sz w:val="18"/>
                 <w:vertAlign w:val="superscript"/>
               </w:rPr>
-              <w:t>42</w:t>
+              <w:t>44</w:t>
             </w:r>
           </w:p>
         </w:tc>
@@ -1569,7 +1654,7 @@
                 <w:sz w:val="18"/>
                 <w:vertAlign w:val="superscript"/>
               </w:rPr>
-              <w:t>10</w:t>
+              <w:t>11</w:t>
             </w:r>
           </w:p>
         </w:tc>
@@ -1648,7 +1733,7 @@
                 <w:sz w:val="18"/>
                 <w:vertAlign w:val="superscript"/>
               </w:rPr>
-              <w:t>43</w:t>
+              <w:t>45</w:t>
             </w:r>
           </w:p>
         </w:tc>
@@ -1727,7 +1812,7 @@
                 <w:sz w:val="18"/>
                 <w:vertAlign w:val="superscript"/>
               </w:rPr>
-              <w:t>19</w:t>
+              <w:t>22</w:t>
             </w:r>
           </w:p>
         </w:tc>
@@ -1794,7 +1879,7 @@
         <w:rPr>
           <w:sz w:val="18"/>
         </w:rPr>
-        <w:t>Abbreviations: AUC, area under the curve; HRV, heart rate variability; ICU, intensive care unit; PHQ-9, Patient Health Questionnaire-9; RHR, resting heart rate; RMSSD, root mean square of successive differences. *Preprint, not yet peer reviewed.</w:t>
+        <w:t>Abbreviations: AUC, area under the curve; HRV, heart rate variability; ICU, intensive care unit; PHQ-9, Patient Health Questionnaire-9; RHR, resting heart rate; RMSSD, root mean square of successive differences.</w:t>
       </w:r>
     </w:p>
     <w:p>
@@ -1819,10 +1904,45 @@
         <w:rPr>
           <w:vertAlign w:val="superscript"/>
         </w:rPr>
-        <w:t>34</w:t>
+        <w:t>36</w:t>
       </w:r>
       <w:r>
         <w:t xml:space="preserve"> Adherence is a concern in clinical staff: when 20 emergency nurses and residents were given WHOOP bands for 6 weeks, only half wore them consistently, and several preferred more familiar devices.</w:t>
+      </w:r>
+      <w:r>
+        <w:rPr>
+          <w:vertAlign w:val="superscript"/>
+        </w:rPr>
+        <w:t>41</w:t>
+      </w:r>
+    </w:p>
+    <w:p>
+      <w:r>
+        <w:rPr>
+          <w:b/>
+        </w:rPr>
+        <w:t>Oura Ring.</w:t>
+      </w:r>
+      <w:r>
+        <w:t xml:space="preserve"> In 45 nurses wearing Oura rings for 30 days, sleep measures distinguished nurses with and without burnout with about 76% accuracy, and heart rate measures tracked changes in emotional exhaustion and depersonalization over time.</w:t>
+      </w:r>
+      <w:r>
+        <w:rPr>
+          <w:vertAlign w:val="superscript"/>
+        </w:rPr>
+        <w:t>13</w:t>
+      </w:r>
+      <w:r>
+        <w:t xml:space="preserve"> In 1290 adults from the Northern Finland Birth Cohort, those with depression and anxiety symptoms had higher night-time heart rate, lower RMSSD during sleep, and less REM and deep sleep.</w:t>
+      </w:r>
+      <w:r>
+        <w:rPr>
+          <w:vertAlign w:val="superscript"/>
+        </w:rPr>
+        <w:t>37</w:t>
+      </w:r>
+      <w:r>
+        <w:t xml:space="preserve"> In a pilot study of 25 nurses, a sleep-aid kit shortened self-reported sleep latency, but Oura-measured HRV did not change.</w:t>
       </w:r>
       <w:r>
         <w:rPr>
@@ -1836,42 +1956,16 @@
         <w:rPr>
           <w:b/>
         </w:rPr>
-        <w:t>Oura Ring.</w:t>
-      </w:r>
-      <w:r>
-        <w:t xml:space="preserve"> In a 14-week randomized trial of 379 first-year college students wearing Oura rings, a nature-based intervention reduced stress and increased HRV, and the reduction in stress partly explained the HRV increase (preprint).</w:t>
+        <w:t>Garmin.</w:t>
+      </w:r>
+      <w:r>
+        <w:t xml:space="preserve"> In 60 adults tested during rest and mental stress tasks, the Garmin stress score differed between conditions and correlated with heart rate and RMSSD from a chest strap, but it predicted self-reported stress only marginally; heart rate itself was the strongest predictor.</w:t>
       </w:r>
       <w:r>
         <w:rPr>
           <w:vertAlign w:val="superscript"/>
         </w:rPr>
-        <w:t>36</w:t>
-      </w:r>
-      <w:r>
-        <w:t xml:space="preserve"> In 31 graduate students monitored for 5 months, days of high emotional distress were associated with lower overnight RMSSD, and higher daily step counts weakened this association (preprint).</w:t>
-      </w:r>
-      <w:r>
-        <w:rPr>
-          <w:vertAlign w:val="superscript"/>
-        </w:rPr>
-        <w:t>35</w:t>
-      </w:r>
-    </w:p>
-    <w:p>
-      <w:r>
-        <w:rPr>
-          <w:b/>
-        </w:rPr>
-        <w:t>Garmin.</w:t>
-      </w:r>
-      <w:r>
-        <w:t xml:space="preserve"> In 95 university students (80 women) followed for 28 days, the Garmin “Stress Score” was associated with high-arousal positive moods but not with negative moods, suggesting that the label “stress” may be misleading (preprint).</w:t>
-      </w:r>
-      <w:r>
-        <w:rPr>
-          <w:vertAlign w:val="superscript"/>
-        </w:rPr>
-        <w:t>38</w:t>
+        <w:t>40</w:t>
       </w:r>
     </w:p>
     <w:p>
@@ -1888,25 +1982,25 @@
         <w:rPr>
           <w:vertAlign w:val="superscript"/>
         </w:rPr>
-        <w:t>10</w:t>
+        <w:t>11</w:t>
       </w:r>
       <w:r>
         <w:t xml:space="preserve"> and later-than-usual bedtimes to higher resting heart rate in students.</w:t>
+      </w:r>
+      <w:r>
+        <w:rPr>
+          <w:vertAlign w:val="superscript"/>
+        </w:rPr>
+        <w:t>45</w:t>
+      </w:r>
+      <w:r>
+        <w:t xml:space="preserve"> In 329 health care workers wearing Apple Watches, wearable data predicted psychological resilience only weakly.</w:t>
       </w:r>
       <w:r>
         <w:rPr>
           <w:vertAlign w:val="superscript"/>
         </w:rPr>
         <w:t>43</w:t>
-      </w:r>
-      <w:r>
-        <w:t xml:space="preserve"> In 329 health care workers wearing Apple Watches, wearable data predicted psychological resilience only weakly.</w:t>
-      </w:r>
-      <w:r>
-        <w:rPr>
-          <w:vertAlign w:val="superscript"/>
-        </w:rPr>
-        <w:t>41</w:t>
       </w:r>
     </w:p>
     <w:p>
@@ -1925,7 +2019,7 @@
         <w:rPr>
           <w:vertAlign w:val="superscript"/>
         </w:rPr>
-        <w:t>37</w:t>
+        <w:t>38</w:t>
       </w:r>
       <w:r>
         <w:t xml:space="preserve"> I did not identify any study that used a recovery score as an outcome in burnout research. For this reason, raw overnight RMSSD and resting heart rate are more appropriate primary outcomes, with recovery scores treated as secondary measures.</w:t>
@@ -1947,7 +2041,7 @@
         <w:rPr>
           <w:vertAlign w:val="superscript"/>
         </w:rPr>
-        <w:t>44</w:t>
+        <w:t>46</w:t>
       </w:r>
       <w:r>
         <w:t xml:space="preserve"> Fitbit devices performed as well as or better than research actigraphy, whereas Garmin devices performed worse.</w:t>
@@ -1956,7 +2050,7 @@
         <w:rPr>
           <w:vertAlign w:val="superscript"/>
         </w:rPr>
-        <w:t>45</w:t>
+        <w:t>47</w:t>
       </w:r>
       <w:r>
         <w:t xml:space="preserve"> For overnight heart rate and HRV measured against electrocardiography, Oura rings showed the highest accuracy, WHOOP was moderately accurate, and Garmin and Polar were less accurate.</w:t>
@@ -1965,7 +2059,7 @@
         <w:rPr>
           <w:vertAlign w:val="superscript"/>
         </w:rPr>
-        <w:t>46</w:t>
+        <w:t>48</w:t>
       </w:r>
       <w:r>
         <w:t xml:space="preserve"> Apple Watch reports HRV as the standard deviation of normal-to-normal intervals (SDNN) rather than RMSSD, so its values cannot be pooled directly with those from other devices.</w:t>
@@ -2063,7 +2157,7 @@
         <w:rPr>
           <w:vertAlign w:val="superscript"/>
         </w:rPr>
-        <w:t>15</w:t>
+        <w:t>18</w:t>
       </w:r>
       <w:r>
         <w:t xml:space="preserve"> I did not identify any study that examined burnout in relation to overnight HRV and sleep recorded by women's own wearable devices.</w:t>
@@ -2100,7 +2194,7 @@
         <w:rPr>
           <w:vertAlign w:val="superscript"/>
         </w:rPr>
-        <w:t>17,18</w:t>
+        <w:t>20,21</w:t>
       </w:r>
       <w:r>
         <w:t xml:space="preserve"> but none has examined whether burnout reduces this recovery.</w:t>
@@ -2123,7 +2217,7 @@
         <w:rPr>
           <w:vertAlign w:val="superscript"/>
         </w:rPr>
-        <w:t>31,32</w:t>
+        <w:t>33,34</w:t>
       </w:r>
     </w:p>
     <w:p>
@@ -2143,7 +2237,7 @@
         <w:rPr>
           <w:vertAlign w:val="superscript"/>
         </w:rPr>
-        <w:t>13</w:t>
+        <w:t>16</w:t>
       </w:r>
     </w:p>
     <w:p>
@@ -2163,7 +2257,7 @@
         <w:rPr>
           <w:vertAlign w:val="superscript"/>
         </w:rPr>
-        <w:t>37</w:t>
+        <w:t>38</w:t>
       </w:r>
     </w:p>
     <w:p>
@@ -2176,13 +2270,13 @@
     </w:p>
     <w:p>
       <w:r>
-        <w:t>These gaps point toward a study of women aged 18 years and older, including both university students and working women, who already use a consumer wearable device. Burnout would be measured with the personal burnout scale of the Copenhagen Burnout Inventory, which is identical in the student and work versions.</w:t>
+        <w:t>These gaps point toward a study of women aged 18 years and older, including both university students and working women, who already use a consumer wearable device. Burnout would be measured with the personal burnout scale of the Copenhagen Burnout Inventory, which is included in both the work and student versions.</w:t>
       </w:r>
       <w:r>
         <w:rPr>
           <w:vertAlign w:val="superscript"/>
         </w:rPr>
-        <w:t>23</w:t>
+        <w:t>26</w:t>
       </w:r>
       <w:r>
         <w:t xml:space="preserve"> Outcomes would be nightly RMSSD, resting heart rate, and sleep duration, efficiency, and regularity over at least 30 days, ideally including one break period. Depression, age, body mass index, menstrual cycle phase, contraceptive use, shift work, alcohol and caffeine intake, and physical activity would be measured as covariates. Based on the literature, I propose three hypotheses:</w:t>
@@ -2263,19 +2357,7 @@
         <w:rPr>
           <w:i w:val="0"/>
         </w:rPr>
-        <w:t xml:space="preserve">Gómez-Urquiza JL, Velando-Soriano A, Membrive-Jiménez MJ, et al. Prevalence and levels of burnout in nursing students: a systematic review with meta-analysis. </w:t>
-      </w:r>
-      <w:r>
-        <w:rPr>
-          <w:i/>
-        </w:rPr>
-        <w:t>Nurse Educ Pract</w:t>
-      </w:r>
-      <w:r>
-        <w:rPr>
-          <w:i w:val="0"/>
-        </w:rPr>
-        <w:t>. 2023;72:103753. doi:10.1016/j.nepr.2023.103753</w:t>
+        <w:t>World Health Organization. Burn-out an "occupational phenomenon": International Classification of Diseases. Published May 28, 2019. Accessed October 7, 2026. https://www.who.int/news/item/28-05-2019-burn-out-an-occupational-phenomenon-international-classification-of-diseases</w:t>
       </w:r>
     </w:p>
     <w:p>
@@ -2290,19 +2372,19 @@
         <w:rPr>
           <w:i w:val="0"/>
         </w:rPr>
-        <w:t xml:space="preserve">Hernández-Mariano JÁ, Hurtado-Salgado E, Velázquez-Núñez MDC, Cupul-Uicab LA. Prevalence of academic burnout among nursing students: a systematic review and meta-analysis. </w:t>
+        <w:t xml:space="preserve">Gómez-Urquiza JL, Velando-Soriano A, Membrive-Jiménez MJ, et al. Prevalence and levels of burnout in nursing students: a systematic review with meta-analysis. </w:t>
       </w:r>
       <w:r>
         <w:rPr>
           <w:i/>
         </w:rPr>
-        <w:t>J Nurs Educ</w:t>
+        <w:t>Nurse Educ Pract</w:t>
       </w:r>
       <w:r>
         <w:rPr>
           <w:i w:val="0"/>
         </w:rPr>
-        <w:t>. 2024;63(8):533-539. doi:10.3928/01484834-20240502-04</w:t>
+        <w:t>. 2023;72:103753. doi:10.1016/j.nepr.2023.103753</w:t>
       </w:r>
     </w:p>
     <w:p>
@@ -2317,19 +2399,19 @@
         <w:rPr>
           <w:i w:val="0"/>
         </w:rPr>
-        <w:t xml:space="preserve">Hoff T, Lee DR. Burnout and physician gender: what do we know? </w:t>
+        <w:t xml:space="preserve">Hernández-Mariano JÁ, Hurtado-Salgado E, Velázquez-Núñez MDC, Cupul-Uicab LA. Prevalence of academic burnout among nursing students: a systematic review and meta-analysis. </w:t>
       </w:r>
       <w:r>
         <w:rPr>
           <w:i/>
         </w:rPr>
-        <w:t>Med Care</w:t>
+        <w:t>J Nurs Educ</w:t>
       </w:r>
       <w:r>
         <w:rPr>
           <w:i w:val="0"/>
         </w:rPr>
-        <w:t>. 2021;59(8):711-720. doi:10.1097/mlr.0000000000001584</w:t>
+        <w:t>. 2024;63(8):533-539. doi:10.3928/01484834-20240502-04</w:t>
       </w:r>
     </w:p>
     <w:p>
@@ -2344,19 +2426,19 @@
         <w:rPr>
           <w:i w:val="0"/>
         </w:rPr>
-        <w:t xml:space="preserve">Membrive-Jiménez MJ, Gómez-Urquiza JL, Suleiman-Martos N, et al. Relation between burnout and sleep problems in nurses: a systematic review with meta-analysis. </w:t>
+        <w:t xml:space="preserve">Hoff T, Lee DR. Burnout and physician gender: what do we know? </w:t>
       </w:r>
       <w:r>
         <w:rPr>
           <w:i/>
         </w:rPr>
-        <w:t>Healthcare (Basel)</w:t>
+        <w:t>Med Care</w:t>
       </w:r>
       <w:r>
         <w:rPr>
           <w:i w:val="0"/>
         </w:rPr>
-        <w:t>. 2022;10(5):954. doi:10.3390/healthcare10050954</w:t>
+        <w:t>. 2021;59(8):711-720. doi:10.1097/mlr.0000000000001584</w:t>
       </w:r>
     </w:p>
     <w:p>
@@ -2371,19 +2453,19 @@
         <w:rPr>
           <w:i w:val="0"/>
         </w:rPr>
-        <w:t xml:space="preserve">Zakiei A, Khazaie H, Azadi M, Mohsenpour S, Komasi S. The mechanism of sleep quality's effect on academic burnout: examining the mediating role of perceived stress. </w:t>
+        <w:t xml:space="preserve">Membrive-Jiménez MJ, Gómez-Urquiza JL, Suleiman-Martos N, et al. Relation between burnout and sleep problems in nurses: a systematic review with meta-analysis. </w:t>
       </w:r>
       <w:r>
         <w:rPr>
           <w:i/>
         </w:rPr>
-        <w:t>BMC Med Educ</w:t>
+        <w:t>Healthcare (Basel)</w:t>
       </w:r>
       <w:r>
         <w:rPr>
           <w:i w:val="0"/>
         </w:rPr>
-        <w:t>. 2025;25(1):1018. doi:10.1186/s12909-025-07617-6</w:t>
+        <w:t>. 2022;10(5):954. doi:10.3390/healthcare10050954</w:t>
       </w:r>
     </w:p>
     <w:p>
@@ -2398,19 +2480,19 @@
         <w:rPr>
           <w:i w:val="0"/>
         </w:rPr>
-        <w:t xml:space="preserve">Höglund P, Hakelind C, Nordin M, Nordin S. Risk factors for insomnia and burnout: a longitudinal population-based cohort study. </w:t>
+        <w:t xml:space="preserve">Zakiei A, Khazaie H, Azadi M, Mohsenpour S, Komasi S. The mechanism of sleep quality's effect on academic burnout: examining the mediating role of perceived stress. </w:t>
       </w:r>
       <w:r>
         <w:rPr>
           <w:i/>
         </w:rPr>
-        <w:t>Stress Health</w:t>
+        <w:t>BMC Med Educ</w:t>
       </w:r>
       <w:r>
         <w:rPr>
           <w:i w:val="0"/>
         </w:rPr>
-        <w:t>. 2023;39(4):798-812. doi:10.1002/smi.3218</w:t>
+        <w:t>. 2025;25(1):1018. doi:10.1186/s12909-025-07617-6</w:t>
       </w:r>
     </w:p>
     <w:p>
@@ -2425,19 +2507,19 @@
         <w:rPr>
           <w:i w:val="0"/>
         </w:rPr>
-        <w:t xml:space="preserve">Rudman A, Arborelius L, Dahlgren A, Finnes A, Gustavsson P. Consequences of early career nurse burnout: a prospective long-term follow-up on cognitive functions, depressive symptoms, and insomnia. </w:t>
+        <w:t xml:space="preserve">Höglund P, Hakelind C, Nordin M, Nordin S. Risk factors for insomnia and burnout: a longitudinal population-based cohort study. </w:t>
       </w:r>
       <w:r>
         <w:rPr>
           <w:i/>
         </w:rPr>
-        <w:t>EClinicalMedicine</w:t>
+        <w:t>Stress Health</w:t>
       </w:r>
       <w:r>
         <w:rPr>
           <w:i w:val="0"/>
         </w:rPr>
-        <w:t>. 2020;27:100565. doi:10.1016/j.eclinm.2020.100565</w:t>
+        <w:t>. 2023;39(4):798-812. doi:10.1002/smi.3218</w:t>
       </w:r>
     </w:p>
     <w:p>
@@ -2452,19 +2534,19 @@
         <w:rPr>
           <w:i w:val="0"/>
         </w:rPr>
-        <w:t xml:space="preserve">Świtaj P, Baka Ł, Kapica Ł, Bugajska J, Januszczak J, Sienkiewicz-Jarosz H. Insomnia mediates the longitudinal association between loneliness and burnout among nurses. </w:t>
+        <w:t xml:space="preserve">Rudman A, Arborelius L, Dahlgren A, Finnes A, Gustavsson P. Consequences of early career nurse burnout: a prospective long-term follow-up on cognitive functions, depressive symptoms, and insomnia. </w:t>
       </w:r>
       <w:r>
         <w:rPr>
           <w:i/>
         </w:rPr>
-        <w:t>Sci Rep</w:t>
+        <w:t>EClinicalMedicine</w:t>
       </w:r>
       <w:r>
         <w:rPr>
           <w:i w:val="0"/>
         </w:rPr>
-        <w:t>. 2025;15(1):25384. doi:10.1038/s41598-025-11264-8</w:t>
+        <w:t>. 2020;27:100565. doi:10.1016/j.eclinm.2020.100565</w:t>
       </w:r>
     </w:p>
     <w:p>
@@ -2479,19 +2561,19 @@
         <w:rPr>
           <w:i w:val="0"/>
         </w:rPr>
-        <w:t xml:space="preserve">Frick S, Smolders K, van der Meij L, Demerouti E, de Kort Y. The bidirectional relationship between sleep and daily burnout-related experiences: self-report vs actigraphy-derived measures. </w:t>
+        <w:t xml:space="preserve">Świtaj P, Baka Ł, Kapica Ł, Bugajska J, Januszczak J, Sienkiewicz-Jarosz H. Insomnia mediates the longitudinal association between loneliness and burnout among nurses. </w:t>
       </w:r>
       <w:r>
         <w:rPr>
           <w:i/>
         </w:rPr>
-        <w:t>Sleep Health</w:t>
+        <w:t>Sci Rep</w:t>
       </w:r>
       <w:r>
         <w:rPr>
           <w:i w:val="0"/>
         </w:rPr>
-        <w:t>. 2025;11(3):382-389. doi:10.1016/j.sleh.2025.03.007</w:t>
+        <w:t>. 2025;15(1):25384. doi:10.1038/s41598-025-11264-8</w:t>
       </w:r>
     </w:p>
     <w:p>
@@ -2506,19 +2588,19 @@
         <w:rPr>
           <w:i w:val="0"/>
         </w:rPr>
-        <w:t xml:space="preserve">Fang Y, Forger DB, Frank E, Sen S, Goldstein C. Day-to-day variability in sleep parameters and depression risk: a prospective cohort study of training physicians. </w:t>
+        <w:t xml:space="preserve">Frick S, Smolders K, van der Meij L, Demerouti E, de Kort Y. The bidirectional relationship between sleep and daily burnout-related experiences: self-report vs actigraphy-derived measures. </w:t>
       </w:r>
       <w:r>
         <w:rPr>
           <w:i/>
         </w:rPr>
-        <w:t>NPJ Digit Med</w:t>
+        <w:t>Sleep Health</w:t>
       </w:r>
       <w:r>
         <w:rPr>
           <w:i w:val="0"/>
         </w:rPr>
-        <w:t>. 2021;4(1):28. doi:10.1038/s41746-021-00400-z</w:t>
+        <w:t>. 2025;11(3):382-389. doi:10.1016/j.sleh.2025.03.007</w:t>
       </w:r>
     </w:p>
     <w:p>
@@ -2533,19 +2615,19 @@
         <w:rPr>
           <w:i w:val="0"/>
         </w:rPr>
-        <w:t xml:space="preserve">Järvelin-Pasanen S, Sinikallio S, Tarvainen MP. Heart rate variability and occupational stress: systematic review. </w:t>
+        <w:t xml:space="preserve">Fang Y, Forger DB, Frank E, Sen S, Goldstein C. Day-to-day variability in sleep parameters and depression risk: a prospective cohort study of training physicians. </w:t>
       </w:r>
       <w:r>
         <w:rPr>
           <w:i/>
         </w:rPr>
-        <w:t>Ind Health</w:t>
+        <w:t>NPJ Digit Med</w:t>
       </w:r>
       <w:r>
         <w:rPr>
           <w:i w:val="0"/>
         </w:rPr>
-        <w:t>. 2018;56(6):500-511. doi:10.2486/indhealth.2017-0190</w:t>
+        <w:t>. 2021;4(1):28. doi:10.1038/s41746-021-00400-z</w:t>
       </w:r>
     </w:p>
     <w:p>
@@ -2560,19 +2642,19 @@
         <w:rPr>
           <w:i w:val="0"/>
         </w:rPr>
-        <w:t xml:space="preserve">Lennartsson AK, Jonsdottir I, Sjörs A. Low heart rate variability in patients with clinical burnout. </w:t>
+        <w:t xml:space="preserve">Veeramachaneni K, Slavish DC, Dietch JR, Kelly K, Taylor DJ. Intraindividual variability in sleep and perceived stress in young adults. </w:t>
       </w:r>
       <w:r>
         <w:rPr>
           <w:i/>
         </w:rPr>
-        <w:t>Int J Psychophysiol</w:t>
+        <w:t>Sleep Health</w:t>
       </w:r>
       <w:r>
         <w:rPr>
           <w:i w:val="0"/>
         </w:rPr>
-        <w:t>. 2016;110:171-178. doi:10.1016/j.ijpsycho.2016.08.005</w:t>
+        <w:t>. 2019;5(6):572-579. doi:10.1016/j.sleh.2019.07.009</w:t>
       </w:r>
     </w:p>
     <w:p>
@@ -2587,19 +2669,19 @@
         <w:rPr>
           <w:i w:val="0"/>
         </w:rPr>
-        <w:t xml:space="preserve">Kanthak MK, Stalder T, Hill LK, Thayer JF, Penz M, Kirschbaum C. Autonomic dysregulation in burnout and depression: evidence for the central role of exhaustion. </w:t>
+        <w:t xml:space="preserve">Bourassa KA, Lamichhane B, Bartek N, Bautista C, Sano A, Madan A. Objective biobehavioral measures reflect burnout states and temporal changes in a nursing population: a prospective observational assessment. </w:t>
       </w:r>
       <w:r>
         <w:rPr>
           <w:i/>
         </w:rPr>
-        <w:t>Scand J Work Environ Health</w:t>
+        <w:t>Nurs Rep</w:t>
       </w:r>
       <w:r>
         <w:rPr>
           <w:i w:val="0"/>
         </w:rPr>
-        <w:t>. 2017;43(5):475-484. doi:10.5271/sjweh.3647</w:t>
+        <w:t>. 2026;16(1):36. doi:10.3390/nursrep16010036</w:t>
       </w:r>
     </w:p>
     <w:p>
@@ -2614,19 +2696,19 @@
         <w:rPr>
           <w:i w:val="0"/>
         </w:rPr>
-        <w:t xml:space="preserve">Turner W, La Marca R, Infanger D, et al. Heart rate variability across recording conditions: associations with depression and burnout in inpatients with stress-related disorders. </w:t>
+        <w:t xml:space="preserve">Järvelin-Pasanen S, Sinikallio S, Tarvainen MP. Heart rate variability and occupational stress: systematic review. </w:t>
       </w:r>
       <w:r>
         <w:rPr>
           <w:i/>
         </w:rPr>
-        <w:t>J Psychosom Res</w:t>
+        <w:t>Ind Health</w:t>
       </w:r>
       <w:r>
         <w:rPr>
           <w:i w:val="0"/>
         </w:rPr>
-        <w:t>. 2026;207:112674. doi:10.1016/j.jpsychores.2026.112674</w:t>
+        <w:t>. 2018;56(6):500-511. doi:10.2486/indhealth.2017-0190</w:t>
       </w:r>
     </w:p>
     <w:p>
@@ -2641,19 +2723,19 @@
         <w:rPr>
           <w:i w:val="0"/>
         </w:rPr>
-        <w:t xml:space="preserve">Böckelmann I, Hartung J, Darius S, Sammito S, Thielmann B. Heart rate variability and burnout risk among healthy employees in jobs involving interaction with others. </w:t>
+        <w:t xml:space="preserve">Lennartsson AK, Jonsdottir I, Sjörs A. Low heart rate variability in patients with clinical burnout. </w:t>
       </w:r>
       <w:r>
         <w:rPr>
           <w:i/>
         </w:rPr>
-        <w:t>Front Physiol</w:t>
+        <w:t>Int J Psychophysiol</w:t>
       </w:r>
       <w:r>
         <w:rPr>
           <w:i w:val="0"/>
         </w:rPr>
-        <w:t>. 2026;17:1908141. doi:10.3389/fphys.2026.1908141</w:t>
+        <w:t>. 2016;110:171-178. doi:10.1016/j.ijpsycho.2016.08.005</w:t>
       </w:r>
     </w:p>
     <w:p>
@@ -2668,19 +2750,19 @@
         <w:rPr>
           <w:i w:val="0"/>
         </w:rPr>
-        <w:t xml:space="preserve">Gilin DA, Anderson GG, Etezad S, Lee-Baggley D, Cooper AM, Preston RJ. Impact of a wellness leadership intervention on the empathy, burnout, and resting heart rate of medical faculty. </w:t>
+        <w:t xml:space="preserve">Kanthak MK, Stalder T, Hill LK, Thayer JF, Penz M, Kirschbaum C. Autonomic dysregulation in burnout and depression: evidence for the central role of exhaustion. </w:t>
       </w:r>
       <w:r>
         <w:rPr>
           <w:i/>
         </w:rPr>
-        <w:t>Mayo Clin Proc Innov Qual Outcomes</w:t>
+        <w:t>Scand J Work Environ Health</w:t>
       </w:r>
       <w:r>
         <w:rPr>
           <w:i w:val="0"/>
         </w:rPr>
-        <w:t>. 2023;7(6):545-555. doi:10.1016/j.mayocpiqo.2023.09.005</w:t>
+        <w:t>. 2017;43(5):475-484. doi:10.5271/sjweh.3647</w:t>
       </w:r>
     </w:p>
     <w:p>
@@ -2695,19 +2777,19 @@
         <w:rPr>
           <w:i w:val="0"/>
         </w:rPr>
-        <w:t xml:space="preserve">Hübner M, Lechleitner P, Neumayr G. Effects of a one-week vacation with various activity programs on well-being, heart rate variability, and sleep quality in healthy vacationers: an open comparative study. </w:t>
+        <w:t xml:space="preserve">Turner W, La Marca R, Infanger D, et al. Heart rate variability across recording conditions: associations with depression and burnout in inpatients with stress-related disorders. </w:t>
       </w:r>
       <w:r>
         <w:rPr>
           <w:i/>
         </w:rPr>
-        <w:t>BMC Public Health</w:t>
+        <w:t>J Psychosom Res</w:t>
       </w:r>
       <w:r>
         <w:rPr>
           <w:i w:val="0"/>
         </w:rPr>
-        <w:t>. 2022;22(1):2435. doi:10.1186/s12889-022-14838-7</w:t>
+        <w:t>. 2026;207:112674. doi:10.1016/j.jpsychores.2026.112674</w:t>
       </w:r>
     </w:p>
     <w:p>
@@ -2722,19 +2804,19 @@
         <w:rPr>
           <w:i w:val="0"/>
         </w:rPr>
-        <w:t xml:space="preserve">Pratap A, Steinhubl S, Neto EC, et al. Changes in continuous, long-term heart rate variability and individualized physiological responses to wellness and vacation interventions using a wearable sensor. </w:t>
+        <w:t xml:space="preserve">Böckelmann I, Hartung J, Darius S, Sammito S, Thielmann B. Heart rate variability and burnout risk among healthy employees in jobs involving interaction with others. </w:t>
       </w:r>
       <w:r>
         <w:rPr>
           <w:i/>
         </w:rPr>
-        <w:t>Front Cardiovasc Med</w:t>
+        <w:t>Front Physiol</w:t>
       </w:r>
       <w:r>
         <w:rPr>
           <w:i w:val="0"/>
         </w:rPr>
-        <w:t>. 2020;7:120. doi:10.3389/fcvm.2020.00120</w:t>
+        <w:t>. 2026;17:1908141. doi:10.3389/fphys.2026.1908141</w:t>
       </w:r>
     </w:p>
     <w:p>
@@ -2749,19 +2831,19 @@
         <w:rPr>
           <w:i w:val="0"/>
         </w:rPr>
-        <w:t xml:space="preserve">Hruska B, Pressman SD, Bendinskas K, Gump BB. Do vacations alter the connection between stress and cardiovascular activity? The effects of a planned vacation on the relationship between weekly stress and ambulatory heart rate. </w:t>
+        <w:t xml:space="preserve">Gilin DA, Anderson GG, Etezad S, Lee-Baggley D, Cooper AM, Preston RJ. Impact of a wellness leadership intervention on the empathy, burnout, and resting heart rate of medical faculty. </w:t>
       </w:r>
       <w:r>
         <w:rPr>
           <w:i/>
         </w:rPr>
-        <w:t>Psychol Health</w:t>
+        <w:t>Mayo Clin Proc Innov Qual Outcomes</w:t>
       </w:r>
       <w:r>
         <w:rPr>
           <w:i w:val="0"/>
         </w:rPr>
-        <w:t>. 2020;35(8):984-999. doi:10.1080/08870446.2019.1687699</w:t>
+        <w:t>. 2023;7(6):545-555. doi:10.1016/j.mayocpiqo.2023.09.005</w:t>
       </w:r>
     </w:p>
     <w:p>
@@ -2776,19 +2858,19 @@
         <w:rPr>
           <w:i w:val="0"/>
         </w:rPr>
-        <w:t xml:space="preserve">Maskevich S, Cassanet A, Allen NB, Trinder J, Bei B. Sleep and stress in adolescents: the roles of pre-sleep arousal and coping during school and vacation. </w:t>
+        <w:t xml:space="preserve">Hübner M, Lechleitner P, Neumayr G. Effects of a one-week vacation with various activity programs on well-being, heart rate variability, and sleep quality in healthy vacationers: an open comparative study. </w:t>
       </w:r>
       <w:r>
         <w:rPr>
           <w:i/>
         </w:rPr>
-        <w:t>Sleep Med</w:t>
+        <w:t>BMC Public Health</w:t>
       </w:r>
       <w:r>
         <w:rPr>
           <w:i w:val="0"/>
         </w:rPr>
-        <w:t>. 2020;66:130-138. doi:10.1016/j.sleep.2019.10.006</w:t>
+        <w:t>. 2022;22(1):2435. doi:10.1186/s12889-022-14838-7</w:t>
       </w:r>
     </w:p>
     <w:p>
@@ -2803,19 +2885,19 @@
         <w:rPr>
           <w:i w:val="0"/>
         </w:rPr>
-        <w:t xml:space="preserve">Chen Y, Xu K, Zhao Y, et al. The impact of school life and holidays on sleep and physical activity patterns in junior high school students: a small-sample longitudinal study using wearable devices. </w:t>
+        <w:t xml:space="preserve">Pratap A, Steinhubl S, Neto EC, et al. Changes in continuous, long-term heart rate variability and individualized physiological responses to wellness and vacation interventions using a wearable sensor. </w:t>
       </w:r>
       <w:r>
         <w:rPr>
           <w:i/>
         </w:rPr>
-        <w:t>Front Public Health</w:t>
+        <w:t>Front Cardiovasc Med</w:t>
       </w:r>
       <w:r>
         <w:rPr>
           <w:i w:val="0"/>
         </w:rPr>
-        <w:t>. 2026;14:1833198. doi:10.3389/fpubh.2026.1833198</w:t>
+        <w:t>. 2020;7:120. doi:10.3389/fcvm.2020.00120</w:t>
       </w:r>
     </w:p>
     <w:p>
@@ -2830,19 +2912,19 @@
         <w:rPr>
           <w:i w:val="0"/>
         </w:rPr>
-        <w:t xml:space="preserve">Kazlauskas E, Dumarkaite A, Gelezelyte O, Nomeikaite A, Zelviene P. Validation of the Recovery Experience Questionnaire in a Lithuanian healthcare personnel. </w:t>
+        <w:t xml:space="preserve">Hruska B, Pressman SD, Bendinskas K, Gump BB. Do vacations alter the connection between stress and cardiovascular activity? The effects of a planned vacation on the relationship between weekly stress and ambulatory heart rate. </w:t>
       </w:r>
       <w:r>
         <w:rPr>
           <w:i/>
         </w:rPr>
-        <w:t>Int J Environ Res Public Health</w:t>
+        <w:t>Psychol Health</w:t>
       </w:r>
       <w:r>
         <w:rPr>
           <w:i w:val="0"/>
         </w:rPr>
-        <w:t>. 2023;20(3):2734. doi:10.3390/ijerph20032734</w:t>
+        <w:t>. 2020;35(8):984-999. doi:10.1080/08870446.2019.1687699</w:t>
       </w:r>
     </w:p>
     <w:p>
@@ -2857,19 +2939,19 @@
         <w:rPr>
           <w:i w:val="0"/>
         </w:rPr>
-        <w:t xml:space="preserve">Oluwadiya KS, Owoeye OK, Adeoti AO. Evaluating the factor structure, reliability and validity of the Copenhagen Burnout Inventory-Student Survey (CBI-SS) among faculty of arts students of Ekiti State University, Ado-Ekiti, Nigeria. </w:t>
+        <w:t xml:space="preserve">Maskevich S, Cassanet A, Allen NB, Trinder J, Bei B. Sleep and stress in adolescents: the roles of pre-sleep arousal and coping during school and vacation. </w:t>
       </w:r>
       <w:r>
         <w:rPr>
           <w:i/>
         </w:rPr>
-        <w:t>Sci Rep</w:t>
+        <w:t>Sleep Med</w:t>
       </w:r>
       <w:r>
         <w:rPr>
           <w:i w:val="0"/>
         </w:rPr>
-        <w:t>. 2024;14(1):10476. doi:10.1038/s41598-024-61310-0</w:t>
+        <w:t>. 2020;66:130-138. doi:10.1016/j.sleep.2019.10.006</w:t>
       </w:r>
     </w:p>
     <w:p>
@@ -2884,19 +2966,19 @@
         <w:rPr>
           <w:i w:val="0"/>
         </w:rPr>
-        <w:t xml:space="preserve">Hammoud S, Karam R, Mourad R, Saad I, Kurdi M. Stress and heart rate variability during university final examination among Lebanese students. </w:t>
+        <w:t xml:space="preserve">Chen Y, Xu K, Zhao Y, et al. The impact of school life and holidays on sleep and physical activity patterns in junior high school students: a small-sample longitudinal study using wearable devices. </w:t>
       </w:r>
       <w:r>
         <w:rPr>
           <w:i/>
         </w:rPr>
-        <w:t>Behav Sci (Basel)</w:t>
+        <w:t>Front Public Health</w:t>
       </w:r>
       <w:r>
         <w:rPr>
           <w:i w:val="0"/>
         </w:rPr>
-        <w:t>. 2018;9(1):3. doi:10.3390/bs9010003</w:t>
+        <w:t>. 2026;14:1833198. doi:10.3389/fpubh.2026.1833198</w:t>
       </w:r>
     </w:p>
     <w:p>
@@ -2911,19 +2993,19 @@
         <w:rPr>
           <w:i w:val="0"/>
         </w:rPr>
-        <w:t xml:space="preserve">Phillips AJK, Clerx WM, O'Brien CS, et al. Irregular sleep/wake patterns are associated with poorer academic performance and delayed circadian and sleep/wake timing. </w:t>
+        <w:t xml:space="preserve">Kazlauskas E, Dumarkaite A, Gelezelyte O, Nomeikaite A, Zelviene P. Validation of the Recovery Experience Questionnaire in a Lithuanian healthcare personnel. </w:t>
       </w:r>
       <w:r>
         <w:rPr>
           <w:i/>
         </w:rPr>
-        <w:t>Sci Rep</w:t>
+        <w:t>Int J Environ Res Public Health</w:t>
       </w:r>
       <w:r>
         <w:rPr>
           <w:i w:val="0"/>
         </w:rPr>
-        <w:t>. 2017;7(1):3216. doi:10.1038/s41598-017-03171-4</w:t>
+        <w:t>. 2023;20(3):2734. doi:10.3390/ijerph20032734</w:t>
       </w:r>
     </w:p>
     <w:p>
@@ -2938,19 +3020,19 @@
         <w:rPr>
           <w:i w:val="0"/>
         </w:rPr>
-        <w:t xml:space="preserve">Sathyanarayana A, Amin OB, An J, Onnela JP. Examining the use of consumer wearable devices and digital tools for stress measurement in college students: scoping review of methods. </w:t>
+        <w:t xml:space="preserve">Oluwadiya KS, Owoeye OK, Adeoti AO. Evaluating the factor structure, reliability and validity of the Copenhagen Burnout Inventory-Student Survey (CBI-SS) among faculty of arts students of Ekiti State University, Ado-Ekiti, Nigeria. </w:t>
       </w:r>
       <w:r>
         <w:rPr>
           <w:i/>
         </w:rPr>
-        <w:t>JMIR Mhealth Uhealth</w:t>
+        <w:t>Sci Rep</w:t>
       </w:r>
       <w:r>
         <w:rPr>
           <w:i w:val="0"/>
         </w:rPr>
-        <w:t>. 2026;14:e64144. doi:10.2196/64144</w:t>
+        <w:t>. 2024;14(1):10476. doi:10.1038/s41598-024-61310-0</w:t>
       </w:r>
     </w:p>
     <w:p>
@@ -2965,19 +3047,19 @@
         <w:rPr>
           <w:i w:val="0"/>
         </w:rPr>
-        <w:t xml:space="preserve">Garcia-Ceja E, Alvarado-Uribe J, Escamilla-Ambrosio PJ, et al. A dataset of university students' stress and anxiety levels based on questionnaires and wearable sensors. </w:t>
+        <w:t xml:space="preserve">Hammoud S, Karam R, Mourad R, Saad I, Kurdi M. Stress and heart rate variability during university final examination among Lebanese students. </w:t>
       </w:r>
       <w:r>
         <w:rPr>
           <w:i/>
         </w:rPr>
-        <w:t>Sci Data</w:t>
+        <w:t>Behav Sci (Basel)</w:t>
       </w:r>
       <w:r>
         <w:rPr>
           <w:i w:val="0"/>
         </w:rPr>
-        <w:t>. 2026;13(1):732. doi:10.1038/s41597-026-07085-7</w:t>
+        <w:t>. 2018;9(1):3. doi:10.3390/bs9010003</w:t>
       </w:r>
     </w:p>
     <w:p>
@@ -2992,19 +3074,19 @@
         <w:rPr>
           <w:i w:val="0"/>
         </w:rPr>
-        <w:t xml:space="preserve">Lialiou P, Maglogiannis I. Students' burnout symptoms detection using smartwatch wearable devices: systematic literature review. </w:t>
+        <w:t xml:space="preserve">Phillips AJK, Clerx WM, O'Brien CS, et al. Irregular sleep/wake patterns are associated with poorer academic performance and delayed circadian and sleep/wake timing. </w:t>
       </w:r>
       <w:r>
         <w:rPr>
           <w:i/>
         </w:rPr>
-        <w:t>Preprints.org</w:t>
+        <w:t>Sci Rep</w:t>
       </w:r>
       <w:r>
         <w:rPr>
           <w:i w:val="0"/>
         </w:rPr>
-        <w:t>. Preprint posted online April 7, 2025. doi:10.20944/preprints202503.1236.v2</w:t>
+        <w:t>. 2017;7(1):3216. doi:10.1038/s41598-017-03171-4</w:t>
       </w:r>
     </w:p>
     <w:p>
@@ -3019,19 +3101,19 @@
         <w:rPr>
           <w:i w:val="0"/>
         </w:rPr>
-        <w:t xml:space="preserve">Cañadas-De la Fuente GA, Ortega E, Ramirez-Baena L, De la Fuente-Solana EI, Vargas C, Gómez-Urquiza JL. Gender, marital status, and children as risk factors for burnout in nurses: a meta-analytic study. </w:t>
+        <w:t xml:space="preserve">Sathyanarayana A, Amin OB, An J, Onnela JP. Examining the use of consumer wearable devices and digital tools for stress measurement in college students: scoping review of methods. </w:t>
       </w:r>
       <w:r>
         <w:rPr>
           <w:i/>
         </w:rPr>
-        <w:t>Int J Environ Res Public Health</w:t>
+        <w:t>JMIR Mhealth Uhealth</w:t>
       </w:r>
       <w:r>
         <w:rPr>
           <w:i w:val="0"/>
         </w:rPr>
-        <w:t>. 2018;15(10):2102. doi:10.3390/ijerph15102102</w:t>
+        <w:t>. 2026;14:e64144. doi:10.2196/64144</w:t>
       </w:r>
     </w:p>
     <w:p>
@@ -3046,19 +3128,19 @@
         <w:rPr>
           <w:i w:val="0"/>
         </w:rPr>
-        <w:t xml:space="preserve">Koenig J, Thayer JF. Sex differences in healthy human heart rate variability: a meta-analysis. </w:t>
+        <w:t xml:space="preserve">Garcia-Ceja E, Alvarado-Uribe J, Escamilla-Ambrosio PJ, et al. A dataset of university students' stress and anxiety levels based on questionnaires and wearable sensors. </w:t>
       </w:r>
       <w:r>
         <w:rPr>
           <w:i/>
         </w:rPr>
-        <w:t>Neurosci Biobehav Rev</w:t>
+        <w:t>Sci Data</w:t>
       </w:r>
       <w:r>
         <w:rPr>
           <w:i w:val="0"/>
         </w:rPr>
-        <w:t>. 2016;64:288-310. doi:10.1016/j.neubiorev.2016.03.007</w:t>
+        <w:t>. 2026;13(1):732. doi:10.1038/s41597-026-07085-7</w:t>
       </w:r>
     </w:p>
     <w:p>
@@ -3073,19 +3155,19 @@
         <w:rPr>
           <w:i w:val="0"/>
         </w:rPr>
-        <w:t xml:space="preserve">Schmalenberger KM, Eisenlohr-Moul TA, Würth L, et al. A systematic review and meta-analysis of within-person changes in cardiac vagal activity across the menstrual cycle: implications for female health and future studies. </w:t>
+        <w:t xml:space="preserve">Cañadas-De la Fuente GA, Ortega E, Ramirez-Baena L, De la Fuente-Solana EI, Vargas C, Gómez-Urquiza JL. Gender, marital status, and children as risk factors for burnout in nurses: a meta-analytic study. </w:t>
       </w:r>
       <w:r>
         <w:rPr>
           <w:i/>
         </w:rPr>
-        <w:t>J Clin Med</w:t>
+        <w:t>Int J Environ Res Public Health</w:t>
       </w:r>
       <w:r>
         <w:rPr>
           <w:i w:val="0"/>
         </w:rPr>
-        <w:t>. 2019;8(11):1946. doi:10.3390/jcm8111946</w:t>
+        <w:t>. 2018;15(10):2102. doi:10.3390/ijerph15102102</w:t>
       </w:r>
     </w:p>
     <w:p>
@@ -3100,19 +3182,19 @@
         <w:rPr>
           <w:i w:val="0"/>
         </w:rPr>
-        <w:t xml:space="preserve">de Jager E, Caulfield B, Angelidi E, MacNamee B, Holden S. Wearable-derived heart rate variability across the menstrual cycle, hormonal contraceptive use, and reproductive life stages in females: a living systematic review. </w:t>
+        <w:t xml:space="preserve">Koenig J, Thayer JF. Sex differences in healthy human heart rate variability: a meta-analysis. </w:t>
       </w:r>
       <w:r>
         <w:rPr>
           <w:i/>
         </w:rPr>
-        <w:t>Sports Med</w:t>
+        <w:t>Neurosci Biobehav Rev</w:t>
       </w:r>
       <w:r>
         <w:rPr>
           <w:i w:val="0"/>
         </w:rPr>
-        <w:t>. 2026;56(5):1153-1173. doi:10.1007/s40279-025-02388-y</w:t>
+        <w:t>. 2016;64:288-310. doi:10.1016/j.neubiorev.2016.03.007</w:t>
       </w:r>
     </w:p>
     <w:p>
@@ -3127,19 +3209,19 @@
         <w:rPr>
           <w:i w:val="0"/>
         </w:rPr>
-        <w:t xml:space="preserve">Alzueta E, de Zambotti M, Javitz H, et al. Tracking sleep, temperature, heart rate, and daily symptoms across the menstrual cycle with the Oura Ring in healthy women. </w:t>
+        <w:t xml:space="preserve">Schmalenberger KM, Eisenlohr-Moul TA, Würth L, et al. A systematic review and meta-analysis of within-person changes in cardiac vagal activity across the menstrual cycle: implications for female health and future studies. </w:t>
       </w:r>
       <w:r>
         <w:rPr>
           <w:i/>
         </w:rPr>
-        <w:t>Int J Womens Health</w:t>
+        <w:t>J Clin Med</w:t>
       </w:r>
       <w:r>
         <w:rPr>
           <w:i w:val="0"/>
         </w:rPr>
-        <w:t>. 2022;14:491-503. doi:10.2147/ijwh.s341917</w:t>
+        <w:t>. 2019;8(11):1946. doi:10.3390/jcm8111946</w:t>
       </w:r>
     </w:p>
     <w:p>
@@ -3154,19 +3236,19 @@
         <w:rPr>
           <w:i w:val="0"/>
         </w:rPr>
-        <w:t xml:space="preserve">Holmes KE, Kim J, Fielding F, Zeitzer JM, von Hippel W. Four core circadian behaviors that improve cardiorespiratory fitness through consistent sleep. </w:t>
+        <w:t xml:space="preserve">de Jager E, Caulfield B, Angelidi E, MacNamee B, Holden S. Wearable-derived heart rate variability across the menstrual cycle, hormonal contraceptive use, and reproductive life stages in females: a living systematic review. </w:t>
       </w:r>
       <w:r>
         <w:rPr>
           <w:i/>
         </w:rPr>
-        <w:t>Sleep</w:t>
+        <w:t>Sports Med</w:t>
       </w:r>
       <w:r>
         <w:rPr>
           <w:i w:val="0"/>
         </w:rPr>
-        <w:t>. 2026;49(2):zsaf318. doi:10.1093/sleep/zsaf318</w:t>
+        <w:t>. 2026;56(5):1153-1173. doi:10.1007/s40279-025-02388-y</w:t>
       </w:r>
     </w:p>
     <w:p>
@@ -3181,19 +3263,19 @@
         <w:rPr>
           <w:i w:val="0"/>
         </w:rPr>
-        <w:t xml:space="preserve">Pinkerton C, Guo Y, Qu A. Physical activity buffers physiological stress during high emotional distress: a wearable-derived prospective cohort study. </w:t>
+        <w:t xml:space="preserve">Alzueta E, de Zambotti M, Javitz H, et al. Tracking sleep, temperature, heart rate, and daily symptoms across the menstrual cycle with the Oura Ring in healthy women. </w:t>
       </w:r>
       <w:r>
         <w:rPr>
           <w:i/>
         </w:rPr>
-        <w:t>medRxiv</w:t>
+        <w:t>Int J Womens Health</w:t>
       </w:r>
       <w:r>
         <w:rPr>
           <w:i w:val="0"/>
         </w:rPr>
-        <w:t>. Preprint posted online April 6, 2026. doi:10.64898/2026.04.05.26350215</w:t>
+        <w:t>. 2022;14:491-503. doi:10.2147/ijwh.s341917</w:t>
       </w:r>
     </w:p>
     <w:p>
@@ -3208,19 +3290,19 @@
         <w:rPr>
           <w:i w:val="0"/>
         </w:rPr>
-        <w:t xml:space="preserve">Bloomfield L, Fudolig MI, Kim J, et al. Effects of behavioral interventions on psychological and biometric measures of well-being in young adults: results of a 14-week, four-arm, randomized, controlled trial. </w:t>
+        <w:t xml:space="preserve">Holmes KE, Kim J, Fielding F, Zeitzer JM, von Hippel W. Four core circadian behaviors that improve cardiorespiratory fitness through consistent sleep. </w:t>
       </w:r>
       <w:r>
         <w:rPr>
           <w:i/>
         </w:rPr>
-        <w:t>PsyArXiv</w:t>
+        <w:t>Sleep</w:t>
       </w:r>
       <w:r>
         <w:rPr>
           <w:i w:val="0"/>
         </w:rPr>
-        <w:t>. Preprint posted online June 4, 2025. doi:10.31234/osf.io/sfhbd_v1</w:t>
+        <w:t>. 2026;49(2):zsaf318. doi:10.1093/sleep/zsaf318</w:t>
       </w:r>
     </w:p>
     <w:p>
@@ -3235,19 +3317,19 @@
         <w:rPr>
           <w:i w:val="0"/>
         </w:rPr>
-        <w:t xml:space="preserve">Perrone K, Earley M, Rosenberg G, Pugh C, Kin C. Physiologic readiness and subjective workload of performing operations: a prospective observational study of attending and trainee surgeons. </w:t>
+        <w:t xml:space="preserve">Azadifar S, Sameh A, Nauha L, Kärmeniemi M, Niemelä M, Farrahi V. Severity of depression and anxiety symptoms is reflected in physiological and behavioral metrics collected from a consumer-grade wearable ring. </w:t>
       </w:r>
       <w:r>
         <w:rPr>
           <w:i/>
         </w:rPr>
-        <w:t>Am J Surg</w:t>
+        <w:t>BMC Med</w:t>
       </w:r>
       <w:r>
         <w:rPr>
           <w:i w:val="0"/>
         </w:rPr>
-        <w:t>. 2025;241:116175. doi:10.1016/j.amjsurg.2024.116175</w:t>
+        <w:t>. 2026;24(1):532. doi:10.1186/s12916-026-05276-y</w:t>
       </w:r>
     </w:p>
     <w:p>
@@ -3262,19 +3344,19 @@
         <w:rPr>
           <w:i w:val="0"/>
         </w:rPr>
-        <w:t xml:space="preserve">van der Mee DJ, Koyuncu Z, Lemmers-Jansen I. Are you stressed or just excited? What the Garmin Stress Score can say about your mood. </w:t>
+        <w:t xml:space="preserve">Perrone K, Earley M, Rosenberg G, Pugh C, Kin C. Physiologic readiness and subjective workload of performing operations: a prospective observational study of attending and trainee surgeons. </w:t>
       </w:r>
       <w:r>
         <w:rPr>
           <w:i/>
         </w:rPr>
-        <w:t>PsyArXiv</w:t>
+        <w:t>Am J Surg</w:t>
       </w:r>
       <w:r>
         <w:rPr>
           <w:i w:val="0"/>
         </w:rPr>
-        <w:t>. Preprint posted online September 2, 2025. doi:10.31234/osf.io/97pzb_v1</w:t>
+        <w:t>. 2025;241:116175. doi:10.1016/j.amjsurg.2024.116175</w:t>
       </w:r>
     </w:p>
     <w:p>
@@ -3289,19 +3371,19 @@
         <w:rPr>
           <w:i w:val="0"/>
         </w:rPr>
-        <w:t xml:space="preserve">Agarwal AK, Gonzales R, Scott K, Merchant R. Investigating the feasibility of using a wearable device to measure physiologic health data in emergency nurses and residents: observational cohort study. </w:t>
+        <w:t xml:space="preserve">Norful AA, de Jacq K, Zhao J, et al. Exploring longitudinal physiologic stress measurement and sleep quality interventions to improve psychological well-being in nurses: a pilot study. </w:t>
       </w:r>
       <w:r>
         <w:rPr>
           <w:i/>
         </w:rPr>
-        <w:t>JMIR Form Res</w:t>
+        <w:t>Health Psychol Behav Med</w:t>
       </w:r>
       <w:r>
         <w:rPr>
           <w:i w:val="0"/>
         </w:rPr>
-        <w:t>. 2024;8:e51569. doi:10.2196/51569</w:t>
+        <w:t>. 2025;13(1):2503376. doi:10.1080/21642850.2025.2503376</w:t>
       </w:r>
     </w:p>
     <w:p>
@@ -3316,19 +3398,19 @@
         <w:rPr>
           <w:i w:val="0"/>
         </w:rPr>
-        <w:t xml:space="preserve">Wilton AR, Sheffield K, Wilkes Q, et al. The Burnout PRedictiOn Using Wearable aNd ArtIficial IntelligEnce (BROWNIE) study: a decentralized digital health protocol to predict burnout in registered nurses. </w:t>
+        <w:t xml:space="preserve">Rosenbach H, Itzkovitch A, Gidron Y, Schonberg T. Assessing stress level scores against wearables-driven physiological measurements. </w:t>
       </w:r>
       <w:r>
         <w:rPr>
           <w:i/>
         </w:rPr>
-        <w:t>BMC Nurs</w:t>
+        <w:t>Stress Health</w:t>
       </w:r>
       <w:r>
         <w:rPr>
           <w:i w:val="0"/>
         </w:rPr>
-        <w:t>. 2024;23(1):114. doi:10.1186/s12912-024-01711-8</w:t>
+        <w:t>. 2025;41(6):e70125. doi:10.1002/smi.70125</w:t>
       </w:r>
     </w:p>
     <w:p>
@@ -3343,19 +3425,19 @@
         <w:rPr>
           <w:i w:val="0"/>
         </w:rPr>
-        <w:t xml:space="preserve">Hirten RP, Suprun M, Danieletto M, et al. A machine learning approach to determine resilience utilizing wearable device data: analysis of an observational cohort. </w:t>
+        <w:t xml:space="preserve">Agarwal AK, Gonzales R, Scott K, Merchant R. Investigating the feasibility of using a wearable device to measure physiologic health data in emergency nurses and residents: observational cohort study. </w:t>
       </w:r>
       <w:r>
         <w:rPr>
           <w:i/>
         </w:rPr>
-        <w:t>JAMIA Open</w:t>
+        <w:t>JMIR Form Res</w:t>
       </w:r>
       <w:r>
         <w:rPr>
           <w:i w:val="0"/>
         </w:rPr>
-        <w:t>. 2023;6(2):ooad029. doi:10.1093/jamiaopen/ooad029</w:t>
+        <w:t>. 2024;8:e51569. doi:10.2196/51569</w:t>
       </w:r>
     </w:p>
     <w:p>
@@ -3370,19 +3452,19 @@
         <w:rPr>
           <w:i w:val="0"/>
         </w:rPr>
-        <w:t xml:space="preserve">Sagun S, DeCicco D, Badami V, et al. iSleepFirst: burnout, fatigue, and wearable-tracked sleep deprivation among residents staffing the medical intensive care unit. </w:t>
+        <w:t xml:space="preserve">Wilton AR, Sheffield K, Wilkes Q, et al. The Burnout PRedictiOn Using Wearable aNd ArtIficial IntelligEnce (BROWNIE) study: a decentralized digital health protocol to predict burnout in registered nurses. </w:t>
       </w:r>
       <w:r>
         <w:rPr>
           <w:i/>
         </w:rPr>
-        <w:t>Sleep Breath</w:t>
+        <w:t>BMC Nurs</w:t>
       </w:r>
       <w:r>
         <w:rPr>
           <w:i w:val="0"/>
         </w:rPr>
-        <w:t>. 2023;27(6):2491-2497. doi:10.1007/s11325-023-02839-8</w:t>
+        <w:t>. 2024;23(1):114. doi:10.1186/s12912-024-01711-8</w:t>
       </w:r>
     </w:p>
     <w:p>
@@ -3397,19 +3479,19 @@
         <w:rPr>
           <w:i w:val="0"/>
         </w:rPr>
-        <w:t xml:space="preserve">Faust L, Feldman K, Mattingly SM, Hachen D, Chawla NV. Deviations from normal bedtimes are associated with short-term increases in resting heart rate. </w:t>
+        <w:t xml:space="preserve">Hirten RP, Suprun M, Danieletto M, et al. A machine learning approach to determine resilience utilizing wearable device data: analysis of an observational cohort. </w:t>
       </w:r>
       <w:r>
         <w:rPr>
           <w:i/>
         </w:rPr>
-        <w:t>NPJ Digit Med</w:t>
+        <w:t>JAMIA Open</w:t>
       </w:r>
       <w:r>
         <w:rPr>
           <w:i w:val="0"/>
         </w:rPr>
-        <w:t>. 2020;3:39. doi:10.1038/s41746-020-0250-6</w:t>
+        <w:t>. 2023;6(2):ooad029. doi:10.1093/jamiaopen/ooad029</w:t>
       </w:r>
     </w:p>
     <w:p>
@@ -3424,19 +3506,19 @@
         <w:rPr>
           <w:i w:val="0"/>
         </w:rPr>
-        <w:t xml:space="preserve">Miller DJ, Sargent C, Roach GD. A validation of six wearable devices for estimating sleep, heart rate and heart rate variability in healthy adults. </w:t>
+        <w:t xml:space="preserve">Sagun S, DeCicco D, Badami V, et al. iSleepFirst: burnout, fatigue, and wearable-tracked sleep deprivation among residents staffing the medical intensive care unit. </w:t>
       </w:r>
       <w:r>
         <w:rPr>
           <w:i/>
         </w:rPr>
-        <w:t>Sensors (Basel)</w:t>
+        <w:t>Sleep Breath</w:t>
       </w:r>
       <w:r>
         <w:rPr>
           <w:i w:val="0"/>
         </w:rPr>
-        <w:t>. 2022;22(16):6317. doi:10.3390/s22166317</w:t>
+        <w:t>. 2023;27(6):2491-2497. doi:10.1007/s11325-023-02839-8</w:t>
       </w:r>
     </w:p>
     <w:p>
@@ -3451,19 +3533,19 @@
         <w:rPr>
           <w:i w:val="0"/>
         </w:rPr>
-        <w:t xml:space="preserve">Chinoy ED, Cuellar JA, Huwa KE, et al. Performance of seven consumer sleep-tracking devices compared with polysomnography. </w:t>
+        <w:t xml:space="preserve">Faust L, Feldman K, Mattingly SM, Hachen D, Chawla NV. Deviations from normal bedtimes are associated with short-term increases in resting heart rate. </w:t>
       </w:r>
       <w:r>
         <w:rPr>
           <w:i/>
         </w:rPr>
-        <w:t>Sleep</w:t>
+        <w:t>NPJ Digit Med</w:t>
       </w:r>
       <w:r>
         <w:rPr>
           <w:i w:val="0"/>
         </w:rPr>
-        <w:t>. 2021;44(5):zsaa291. doi:10.1093/sleep/zsaa291</w:t>
+        <w:t>. 2020;3:39. doi:10.1038/s41746-020-0250-6</w:t>
       </w:r>
     </w:p>
     <w:p>
@@ -3472,6 +3554,60 @@
       </w:pPr>
       <w:r>
         <w:t>46.</w:t>
+        <w:tab/>
+      </w:r>
+      <w:r>
+        <w:rPr>
+          <w:i w:val="0"/>
+        </w:rPr>
+        <w:t xml:space="preserve">Miller DJ, Sargent C, Roach GD. A validation of six wearable devices for estimating sleep, heart rate and heart rate variability in healthy adults. </w:t>
+      </w:r>
+      <w:r>
+        <w:rPr>
+          <w:i/>
+        </w:rPr>
+        <w:t>Sensors (Basel)</w:t>
+      </w:r>
+      <w:r>
+        <w:rPr>
+          <w:i w:val="0"/>
+        </w:rPr>
+        <w:t>. 2022;22(16):6317. doi:10.3390/s22166317</w:t>
+      </w:r>
+    </w:p>
+    <w:p>
+      <w:pPr>
+        <w:ind w:left="504" w:hanging="504"/>
+      </w:pPr>
+      <w:r>
+        <w:t>47.</w:t>
+        <w:tab/>
+      </w:r>
+      <w:r>
+        <w:rPr>
+          <w:i w:val="0"/>
+        </w:rPr>
+        <w:t xml:space="preserve">Chinoy ED, Cuellar JA, Huwa KE, et al. Performance of seven consumer sleep-tracking devices compared with polysomnography. </w:t>
+      </w:r>
+      <w:r>
+        <w:rPr>
+          <w:i/>
+        </w:rPr>
+        <w:t>Sleep</w:t>
+      </w:r>
+      <w:r>
+        <w:rPr>
+          <w:i w:val="0"/>
+        </w:rPr>
+        <w:t>. 2021;44(5):zsaa291. doi:10.1093/sleep/zsaa291</w:t>
+      </w:r>
+    </w:p>
+    <w:p>
+      <w:pPr>
+        <w:ind w:left="504" w:hanging="504"/>
+      </w:pPr>
+      <w:r>
+        <w:t>48.</w:t>
         <w:tab/>
       </w:r>
       <w:r>

</xml_diff>

<commit_message>
Burnout review: restrict references to 2021 onward
Replaced or removed 15 sources from 2016-2020; all journal references
verified against PubMed by DOI.

Co-Authored-By: Claude Opus 5.5 <noreply@anthropic.com>
Claude-Session: https://claude.ai/code/session_014QgqFT5Fkzz2mf4ivKRGXX
</commit_message>
<xml_diff>
--- a/downloads/Literature_Review_Burnout_Sleep_Recovery_Women.docx
+++ b/downloads/Literature_Review_Burnout_Sleep_Recovery_Women.docx
@@ -87,7 +87,7 @@
     </w:p>
     <w:p>
       <w:r>
-        <w:t>I searched Europe PMC, which includes PubMed/MEDLINE records, for studies published between 2016 and 2026. Search terms combined burnout and stress (burnout, academic burnout, occupational stress) with sleep (sleep, insomnia, actigraphy, polysomnography), physiological recovery (heart rate variability, resting heart rate, recovery score, readiness score), populations (women, students, nurses, physicians), and devices (wearable, WHOOP, Fitbit, Oura, Apple Watch, Garmin). I prioritized systematic reviews, meta-analyses, longitudinal studies, and studies using wearable devices, and I included only peer-reviewed studies.</w:t>
+        <w:t>I searched Europe PMC, which includes PubMed/MEDLINE records, for studies published between 2021 and 2026. Search terms combined burnout and stress (burnout, academic burnout, occupational stress) with sleep (sleep, insomnia, actigraphy, polysomnography), physiological recovery (heart rate variability, resting heart rate, recovery score, readiness score), populations (women, students, nurses, physicians), and devices (wearable, WHOOP, Fitbit, Oura, Apple Watch, Garmin). I prioritized systematic reviews, meta-analyses, longitudinal studies, and studies using wearable devices, and I included only peer-reviewed studies.</w:t>
       </w:r>
     </w:p>
     <w:p>
@@ -129,7 +129,7 @@
         <w:t>7</w:t>
       </w:r>
       <w:r>
-        <w:t xml:space="preserve"> Among 2474 Swedish nurses, high burnout symptoms early in their careers predicted more frequent sleep problems 11 to 15 years later, even after accounting for current burnout.</w:t>
+        <w:t xml:space="preserve"> In 520 nurses assessed 6 months apart, insomnia mediated the association between loneliness and burnout.</w:t>
       </w:r>
       <w:r>
         <w:rPr>
@@ -138,7 +138,7 @@
         <w:t>8</w:t>
       </w:r>
       <w:r>
-        <w:t xml:space="preserve"> In 520 nurses assessed 6 months apart, insomnia mediated the association between loneliness and burnout.</w:t>
+        <w:t xml:space="preserve"> At the daily level, a 7-day study of 72 employees using actigraphy found that poor sleep quality predicted next-day exhaustion rather than the reverse, and that this effect depended on employees' existing level of burnout.</w:t>
       </w:r>
       <w:r>
         <w:rPr>
@@ -146,8 +146,10 @@
         </w:rPr>
         <w:t>9</w:t>
       </w:r>
-      <w:r>
-        <w:t xml:space="preserve"> At the daily level, a 7-day study of 72 employees using actigraphy found that poor sleep quality predicted next-day exhaustion rather than the reverse, and that this effect depended on employees' existing level of burnout.</w:t>
+    </w:p>
+    <w:p>
+      <w:r>
+        <w:t>Sleep consistency has received less attention than sleep duration or quality. In 2115 first-year physicians wearing Fitbit devices, shorter sleep and greater day-to-day variability in sleep duration and wake time predicted poorer next-day mood and more depressive symptoms.</w:t>
       </w:r>
       <w:r>
         <w:rPr>
@@ -155,10 +157,8 @@
         </w:rPr>
         <w:t>10</w:t>
       </w:r>
-    </w:p>
-    <w:p>
-      <w:r>
-        <w:t>Sleep consistency has received less attention than sleep duration or quality. In 2115 first-year physicians wearing Fitbit devices, shorter sleep and greater day-to-day variability in sleep duration and wake time predicted poorer next-day mood and more depressive symptoms.</w:t>
+      <w:r>
+        <w:t xml:space="preserve"> In 256 college students who kept daily sleep diaries for 2 weeks, a later and more variable sleep midpoint was associated with more depressive symptoms.</w:t>
       </w:r>
       <w:r>
         <w:rPr>
@@ -167,22 +167,13 @@
         <w:t>11</w:t>
       </w:r>
       <w:r>
-        <w:t xml:space="preserve"> Similarly, in 149 college students (59% women) monitored with actigraphy for 1 week, greater night-to-night variability in sleep duration was associated with higher perceived stress, whereas variability in sleep efficiency and sleep timing was not.</w:t>
+        <w:t xml:space="preserve"> In 45 nurses wearing Oura rings for 30 days, those with burnout had more variable sleep than those without burnout.</w:t>
       </w:r>
       <w:r>
         <w:rPr>
           <w:vertAlign w:val="superscript"/>
         </w:rPr>
         <w:t>12</w:t>
-      </w:r>
-      <w:r>
-        <w:t xml:space="preserve"> In 45 nurses wearing Oura rings for 30 days, those with burnout had more variable sleep than those without burnout.</w:t>
-      </w:r>
-      <w:r>
-        <w:rPr>
-          <w:vertAlign w:val="superscript"/>
-        </w:rPr>
-        <w:t>13</w:t>
       </w:r>
       <w:r>
         <w:t xml:space="preserve"> Sleep efficiency itself has rarely been examined in relation to burnout, and most of the evidence on sleep quality in this area relies on questionnaires.</w:t>
@@ -198,7 +189,18 @@
     </w:p>
     <w:p>
       <w:r>
-        <w:t>Chronic work stress is associated with reduced parasympathetic activity. A systematic review of 10 studies found that higher occupational stress was linked to lower HRV, specifically lower root mean square of successive differences (RMSSD) and high-frequency power and a higher low-frequency to high-frequency ratio, although methods varied widely.</w:t>
+        <w:t>Work stress is reflected in reduced parasympathetic activity. A systematic review and meta-analysis of 7 studies in doctors who wore continuous heart rate monitors found that RMSSD and the standard deviation of normal-to-normal intervals (SDNN) were lower during work-related stress periods than during recovery periods.</w:t>
+      </w:r>
+      <w:r>
+        <w:rPr>
+          <w:vertAlign w:val="superscript"/>
+        </w:rPr>
+        <w:t>13</w:t>
+      </w:r>
+    </w:p>
+    <w:p>
+      <w:r>
+        <w:t>Evidence linking burnout itself to HRV is weaker. In 150 working adults in high-stress occupations, perceived stress strongly predicted burnout, whereas the association between wearable-derived HRV and burnout showed only a nonsignificant negative trend.</w:t>
       </w:r>
       <w:r>
         <w:rPr>
@@ -206,10 +208,8 @@
         </w:rPr>
         <w:t>14</w:t>
       </w:r>
-    </w:p>
-    <w:p>
-      <w:r>
-        <w:t>Evidence for burnout itself is strongest in clinical samples. Patients with clinical burnout (n = 54; 40 women) had lower HRV on nearly all measures than healthy individuals, whereas employees with high burnout scores who were still working did not differ from healthy controls.</w:t>
+      <w:r>
+        <w:t xml:space="preserve"> In inpatients with burnout (n = 153; 88 women), associations between burnout severity and HRV were nonlinear and appeared only under specific recording conditions.</w:t>
       </w:r>
       <w:r>
         <w:rPr>
@@ -218,7 +218,18 @@
         <w:t>15</w:t>
       </w:r>
       <w:r>
-        <w:t xml:space="preserve"> In 410 adults from the Dresden Burnout Study, emotional exhaustion, but not cynicism or reduced personal accomplishment, was associated with lower RMSSD, and RMSSD tracked exhaustion-related symptoms more closely than depressed mood.</w:t>
+        <w:t xml:space="preserve"> In 45 nurses followed for 30 days, heart rate measures from Oura rings tracked changes in emotional exhaustion and depersonalization over time.</w:t>
+      </w:r>
+      <w:r>
+        <w:rPr>
+          <w:vertAlign w:val="superscript"/>
+        </w:rPr>
+        <w:t>12</w:t>
+      </w:r>
+    </w:p>
+    <w:p>
+      <w:r>
+        <w:t>Night-time recovery, the measure most relevant to wearable devices, has rarely been studied. In 202 employees with 24-hour electrocardiogram recordings, HRV differed by burnout risk across the whole day and during the daytime, but not at night; associations were weak and largely explained by age and gender.</w:t>
       </w:r>
       <w:r>
         <w:rPr>
@@ -227,7 +238,7 @@
         <w:t>16</w:t>
       </w:r>
       <w:r>
-        <w:t xml:space="preserve"> In inpatients with burnout (n = 153; 88 women), associations between burnout severity and HRV were nonlinear and appeared only under specific recording conditions.</w:t>
+        <w:t xml:space="preserve"> Resting heart rate may be more sensitive to change over time: in 49 medical faculty leaders (67% women) wearing Fitbit devices, sleeping heart rate rose by approximately 1.4 beats per minute over 15 weeks in a wait-list group but not in participants who completed a wellness course.</w:t>
       </w:r>
       <w:r>
         <w:rPr>
@@ -238,27 +249,7 @@
     </w:p>
     <w:p>
       <w:r>
-        <w:t>Night-time recovery, the measure most relevant to wearable devices, has rarely been studied. In 202 employees with 24-hour electrocardiogram recordings, HRV differed by burnout risk across the whole day and during the daytime, but not at night; associations were weak and largely explained by age and gender.</w:t>
-      </w:r>
-      <w:r>
-        <w:rPr>
-          <w:vertAlign w:val="superscript"/>
-        </w:rPr>
-        <w:t>18</w:t>
-      </w:r>
-      <w:r>
-        <w:t xml:space="preserve"> Resting heart rate may be more sensitive to change over time: in 49 medical faculty leaders (67% women) wearing Fitbit devices, sleeping heart rate rose by approximately 1.4 beats per minute over 15 weeks in a wait-list group but not in participants who completed a wellness course.</w:t>
-      </w:r>
-      <w:r>
-        <w:rPr>
-          <w:vertAlign w:val="superscript"/>
-        </w:rPr>
-        <w:t>19</w:t>
-      </w:r>
-    </w:p>
-    <w:p>
-      <w:r>
-        <w:t>Taken together, these findings suggest that effects in nonclinical populations are likely to be small, that exhaustion is the burnout dimension most closely linked to physiology, and that depression should be measured alongside burnout.</w:t>
+        <w:t>Taken together, these findings suggest that associations between burnout and physiology in nonclinical populations are likely to be small and that perceived stress and depression should be measured alongside burnout.</w:t>
       </w:r>
     </w:p>
     <w:p>
@@ -271,60 +262,42 @@
     </w:p>
     <w:p>
       <w:r>
-        <w:t>Time away from work or study offers a natural opportunity to observe recovery. In 52 healthy adults, 24-hour HRV improved after a 1-week active holiday, although the study had no control group.</w:t>
+        <w:t>Time away from work or study offers a natural opportunity to observe recovery. Continuous monitoring in doctors shows that HRV is higher during recovery periods than during work-related stress periods.</w:t>
+      </w:r>
+      <w:r>
+        <w:rPr>
+          <w:vertAlign w:val="superscript"/>
+        </w:rPr>
+        <w:t>13</w:t>
+      </w:r>
+      <w:r>
+        <w:t xml:space="preserve"> In 52 healthy adults, 24-hour HRV improved after a 1-week active holiday, although the study had no control group.</w:t>
+      </w:r>
+      <w:r>
+        <w:rPr>
+          <w:vertAlign w:val="superscript"/>
+        </w:rPr>
+        <w:t>18</w:t>
+      </w:r>
+    </w:p>
+    <w:p>
+      <w:r>
+        <w:t>Evidence in students is limited. In 27 middle school students wearing wrist bands across a full school year, sleep and activity differed between school days, weekends, and winter and summer vacations.</w:t>
+      </w:r>
+      <w:r>
+        <w:rPr>
+          <w:vertAlign w:val="superscript"/>
+        </w:rPr>
+        <w:t>19</w:t>
+      </w:r>
+      <w:r>
+        <w:t xml:space="preserve"> I did not identify any study that tested whether burnout reduces physiological recovery during breaks in university students or working women. The Recovery Experience Questionnaire, which measures psychological detachment and relaxation during time off, may help explain individual differences in recovery.</w:t>
       </w:r>
       <w:r>
         <w:rPr>
           <w:vertAlign w:val="superscript"/>
         </w:rPr>
         <w:t>20</w:t>
-      </w:r>
-      <w:r>
-        <w:t xml:space="preserve"> In 112 adults wearing an electrocardiogram patch before, during, and for 1 month after a 6-day stay at a wellness center, HRV changed during the stay, but individual responses varied widely.</w:t>
-      </w:r>
-      <w:r>
-        <w:rPr>
-          <w:vertAlign w:val="superscript"/>
-        </w:rPr>
-        <w:t>21</w:t>
-      </w:r>
-      <w:r>
-        <w:t xml:space="preserve"> In 54 workers wearing a consumer wrist device, the association between weekly stress and heart rate weakened as a planned vacation approached.</w:t>
-      </w:r>
-      <w:r>
-        <w:rPr>
-          <w:vertAlign w:val="superscript"/>
-        </w:rPr>
-        <w:t>22</w:t>
-      </w:r>
-    </w:p>
-    <w:p>
-      <w:r>
-        <w:t>Comparable evidence in students comes mainly from adolescents. In 146 adolescents wearing actigraphs during the last week of a school term and the following 2-week vacation, stress was associated with longer sleep onset latency in both periods.</w:t>
-      </w:r>
-      <w:r>
-        <w:rPr>
-          <w:vertAlign w:val="superscript"/>
-        </w:rPr>
-        <w:t>23</w:t>
-      </w:r>
-      <w:r>
-        <w:t xml:space="preserve"> In 27 middle school students wearing wrist bands across a full school year, sleep and activity differed between school days, weekends, and winter and summer vacations.</w:t>
-      </w:r>
-      <w:r>
-        <w:rPr>
-          <w:vertAlign w:val="superscript"/>
-        </w:rPr>
-        <w:t>24</w:t>
-      </w:r>
-      <w:r>
-        <w:t xml:space="preserve"> I did not identify any study that tested whether burnout reduces physiological recovery during breaks in university students or working women. The Recovery Experience Questionnaire, which measures psychological detachment and relaxation during time off, may help explain individual differences in recovery.</w:t>
-      </w:r>
-      <w:r>
-        <w:rPr>
-          <w:vertAlign w:val="superscript"/>
-        </w:rPr>
-        <w:t>25</w:t>
       </w:r>
     </w:p>
     <w:p>
@@ -361,7 +334,7 @@
         <w:rPr>
           <w:vertAlign w:val="superscript"/>
         </w:rPr>
-        <w:t>26</w:t>
+        <w:t>21</w:t>
       </w:r>
       <w:r>
         <w:t xml:space="preserve"> Both the original and student versions of the Copenhagen Burnout Inventory include a six-item personal burnout scale that measures physical and psychological fatigue regardless of whether a person is working, which allows students and working adults to be compared on the same measure.</w:t>
@@ -370,47 +343,38 @@
         <w:rPr>
           <w:vertAlign w:val="superscript"/>
         </w:rPr>
-        <w:t>26</w:t>
+        <w:t>21</w:t>
       </w:r>
     </w:p>
     <w:p>
       <w:r>
-        <w:t>Academic stress is also reflected in physiology and sleep. In 90 students (60 women) monitored around a final examination, HRV was lowest before and during the examination and highest afterward, and women had lower HRV than men.</w:t>
+        <w:t>Academic stress is also reflected in physiology. In 237 health professions students (81% women), about one-third showed autonomic imbalance on resting HRV testing, and perceived academic stress was significantly associated with autonomic imbalance among women.</w:t>
       </w:r>
       <w:r>
         <w:rPr>
           <w:vertAlign w:val="superscript"/>
         </w:rPr>
-        <w:t>27</w:t>
-      </w:r>
-      <w:r>
-        <w:t xml:space="preserve"> In 61 undergraduates followed for 30 days, irregular sleepers had a circadian rhythm delayed by about 2.5 hours and poorer academic performance than regular sleepers.</w:t>
+        <w:t>22</w:t>
+      </w:r>
+    </w:p>
+    <w:p>
+      <w:r>
+        <w:t>Wearable research in students has focused mainly on detecting short-term stress. A scoping review of 134 studies found that most relied on electrodermal activity, that about 80% of studies using existing datasets drew on a single dataset of only 15 participants, and that 28% did not report participants' sex.</w:t>
       </w:r>
       <w:r>
         <w:rPr>
           <w:vertAlign w:val="superscript"/>
         </w:rPr>
-        <w:t>28</w:t>
-      </w:r>
-    </w:p>
-    <w:p>
-      <w:r>
-        <w:t>Wearable research in students has focused mainly on detecting short-term stress. A scoping review of 134 studies found that most relied on electrodermal activity, that about 80% of studies using existing datasets drew on a single dataset of only 15 participants, and that 28% did not report participants' sex.</w:t>
+        <w:t>23</w:t>
+      </w:r>
+      <w:r>
+        <w:t xml:space="preserve"> A newly published dataset of Mexican undergraduates followed across a semester with Fitbit Inspire 3 devices and daily stress ratings demonstrates that semester-long monitoring is feasible.</w:t>
       </w:r>
       <w:r>
         <w:rPr>
           <w:vertAlign w:val="superscript"/>
         </w:rPr>
-        <w:t>29</w:t>
-      </w:r>
-      <w:r>
-        <w:t xml:space="preserve"> A newly published dataset of Mexican undergraduates followed across a semester with Fitbit Inspire 3 devices and daily stress ratings demonstrates that semester-long monitoring is feasible.</w:t>
-      </w:r>
-      <w:r>
-        <w:rPr>
-          <w:vertAlign w:val="superscript"/>
-        </w:rPr>
-        <w:t>30</w:t>
+        <w:t>24</w:t>
       </w:r>
     </w:p>
     <w:p>
@@ -432,66 +396,48 @@
         <w:t>4</w:t>
       </w:r>
       <w:r>
-        <w:t xml:space="preserve"> In nurses, a meta-analysis of 78 studies found that gender was associated mainly with depersonalization, which was higher in men.</w:t>
+        <w:t xml:space="preserve"> Similarly, a systematic review of 18 studies including 26 939 emergency physicians found that overall burnout rates did not differ by sex, but a higher proportion of women than men reported high emotional exhaustion (69% vs 57%).</w:t>
       </w:r>
       <w:r>
         <w:rPr>
           <w:vertAlign w:val="superscript"/>
         </w:rPr>
-        <w:t>31</w:t>
-      </w:r>
-      <w:r>
-        <w:t xml:space="preserve"> Because exhaustion is the dimension most closely linked to HRV,</w:t>
+        <w:t>25</w:t>
+      </w:r>
+      <w:r>
+        <w:t xml:space="preserve"> Exhaustion is therefore an appropriate focus for research in women.</w:t>
+      </w:r>
+    </w:p>
+    <w:p>
+      <w:r>
+        <w:t>Women's physiological stress responses may also differ from men's. In a study of educators, women reported higher stress and anxiety than men yet showed higher HRV.</w:t>
       </w:r>
       <w:r>
         <w:rPr>
           <w:vertAlign w:val="superscript"/>
         </w:rPr>
-        <w:t>16</w:t>
-      </w:r>
-      <w:r>
-        <w:t xml:space="preserve"> it is an appropriate focus for research in women.</w:t>
-      </w:r>
-    </w:p>
-    <w:p>
-      <w:r>
-        <w:t>Women's cardiac autonomic profile also differs from men's. A meta-analysis of 172 studies (63 612 participants) found that women had a higher mean heart rate and lower overall HRV but greater vagally mediated (high-frequency) HRV.</w:t>
+        <w:t>26</w:t>
+      </w:r>
+      <w:r>
+        <w:t xml:space="preserve"> HRV also changes across the menstrual cycle: a living systematic review of 16 wearable studies reported that HRV was 3% to 9% higher early in the cycle than late in the cycle and that hormonal contraceptive users had lower HRV.</w:t>
       </w:r>
       <w:r>
         <w:rPr>
           <w:vertAlign w:val="superscript"/>
         </w:rPr>
-        <w:t>32</w:t>
-      </w:r>
-      <w:r>
-        <w:t xml:space="preserve"> HRV also changes across the menstrual cycle: a meta-analysis of 37 studies (1004 women) showed that vagal activity decreases from the follicular to the luteal phase (d = −0.39), with the largest decrease before menstruation.</w:t>
+        <w:t>27</w:t>
+      </w:r>
+      <w:r>
+        <w:t xml:space="preserve"> In 26 healthy women wearing Oura rings across a full cycle, sleep did not vary by phase, whereas skin temperature and heart rate did.</w:t>
       </w:r>
       <w:r>
         <w:rPr>
           <w:vertAlign w:val="superscript"/>
         </w:rPr>
-        <w:t>33</w:t>
-      </w:r>
-      <w:r>
-        <w:t xml:space="preserve"> A living systematic review of 16 wearable studies reported that HRV was 3% to 9% higher early in the cycle than late in the cycle and that hormonal contraceptive users had lower HRV.</w:t>
-      </w:r>
-      <w:r>
-        <w:rPr>
-          <w:vertAlign w:val="superscript"/>
-        </w:rPr>
-        <w:t>34</w:t>
-      </w:r>
-      <w:r>
-        <w:t xml:space="preserve"> In 26 healthy women wearing Oura rings across a full cycle, sleep did not vary by phase, whereas skin temperature and heart rate did.</w:t>
-      </w:r>
-      <w:r>
-        <w:rPr>
-          <w:vertAlign w:val="superscript"/>
-        </w:rPr>
-        <w:t>35</w:t>
-      </w:r>
-      <w:r>
-        <w:t xml:space="preserve"> These cyclical changes are similar in size to the burnout effects described above, so menstrual cycle phase and contraceptive use should be recorded in any study of women.</w:t>
+        <w:t>28</w:t>
+      </w:r>
+      <w:r>
+        <w:t xml:space="preserve"> These cyclical changes may be similar in size to the burnout effects described above, so menstrual cycle phase and contraceptive use should be recorded in any study of women.</w:t>
       </w:r>
     </w:p>
     <w:p>
@@ -627,7 +573,7 @@
                 <w:sz w:val="18"/>
                 <w:vertAlign w:val="superscript"/>
               </w:rPr>
-              <w:t>30</w:t>
+              <w:t>24</w:t>
             </w:r>
           </w:p>
         </w:tc>
@@ -706,7 +652,7 @@
                 <w:sz w:val="18"/>
                 <w:vertAlign w:val="superscript"/>
               </w:rPr>
-              <w:t>36</w:t>
+              <w:t>29</w:t>
             </w:r>
           </w:p>
         </w:tc>
@@ -785,7 +731,7 @@
                 <w:sz w:val="18"/>
                 <w:vertAlign w:val="superscript"/>
               </w:rPr>
-              <w:t>37</w:t>
+              <w:t>30</w:t>
             </w:r>
           </w:p>
         </w:tc>
@@ -864,7 +810,7 @@
                 <w:sz w:val="18"/>
                 <w:vertAlign w:val="superscript"/>
               </w:rPr>
-              <w:t>13</w:t>
+              <w:t>12</w:t>
             </w:r>
           </w:p>
         </w:tc>
@@ -943,7 +889,7 @@
                 <w:sz w:val="18"/>
                 <w:vertAlign w:val="superscript"/>
               </w:rPr>
-              <w:t>10</w:t>
+              <w:t>9</w:t>
             </w:r>
           </w:p>
         </w:tc>
@@ -1022,7 +968,7 @@
                 <w:sz w:val="18"/>
                 <w:vertAlign w:val="superscript"/>
               </w:rPr>
-              <w:t>38</w:t>
+              <w:t>31</w:t>
             </w:r>
           </w:p>
         </w:tc>
@@ -1101,7 +1047,7 @@
                 <w:sz w:val="18"/>
                 <w:vertAlign w:val="superscript"/>
               </w:rPr>
-              <w:t>39</w:t>
+              <w:t>32</w:t>
             </w:r>
           </w:p>
         </w:tc>
@@ -1180,7 +1126,7 @@
                 <w:sz w:val="18"/>
                 <w:vertAlign w:val="superscript"/>
               </w:rPr>
-              <w:t>40</w:t>
+              <w:t>33</w:t>
             </w:r>
           </w:p>
         </w:tc>
@@ -1259,7 +1205,7 @@
                 <w:sz w:val="18"/>
                 <w:vertAlign w:val="superscript"/>
               </w:rPr>
-              <w:t>41</w:t>
+              <w:t>34</w:t>
             </w:r>
           </w:p>
         </w:tc>
@@ -1338,7 +1284,7 @@
                 <w:sz w:val="18"/>
                 <w:vertAlign w:val="superscript"/>
               </w:rPr>
-              <w:t>42</w:t>
+              <w:t>35</w:t>
             </w:r>
           </w:p>
         </w:tc>
@@ -1417,7 +1363,7 @@
                 <w:sz w:val="18"/>
                 <w:vertAlign w:val="superscript"/>
               </w:rPr>
-              <w:t>19</w:t>
+              <w:t>17</w:t>
             </w:r>
           </w:p>
         </w:tc>
@@ -1496,7 +1442,7 @@
                 <w:sz w:val="18"/>
                 <w:vertAlign w:val="superscript"/>
               </w:rPr>
-              <w:t>43</w:t>
+              <w:t>36</w:t>
             </w:r>
           </w:p>
         </w:tc>
@@ -1575,7 +1521,7 @@
                 <w:sz w:val="18"/>
                 <w:vertAlign w:val="superscript"/>
               </w:rPr>
-              <w:t>44</w:t>
+              <w:t>37</w:t>
             </w:r>
           </w:p>
         </w:tc>
@@ -1654,7 +1600,7 @@
                 <w:sz w:val="18"/>
                 <w:vertAlign w:val="superscript"/>
               </w:rPr>
-              <w:t>11</w:t>
+              <w:t>10</w:t>
             </w:r>
           </w:p>
         </w:tc>
@@ -1715,164 +1661,6 @@
           </w:p>
         </w:tc>
       </w:tr>
-      <w:tr>
-        <w:tc>
-          <w:tcPr>
-            <w:tcW w:type="dxa" w:w="1872"/>
-          </w:tcPr>
-          <w:p>
-            <w:r/>
-            <w:r>
-              <w:rPr>
-                <w:sz w:val="18"/>
-              </w:rPr>
-              <w:t>Faust et al (2020)</w:t>
-            </w:r>
-            <w:r>
-              <w:rPr>
-                <w:sz w:val="18"/>
-                <w:vertAlign w:val="superscript"/>
-              </w:rPr>
-              <w:t>45</w:t>
-            </w:r>
-          </w:p>
-        </w:tc>
-        <w:tc>
-          <w:tcPr>
-            <w:tcW w:type="dxa" w:w="1872"/>
-          </w:tcPr>
-          <w:p>
-            <w:r/>
-            <w:r>
-              <w:rPr>
-                <w:sz w:val="18"/>
-              </w:rPr>
-              <w:t>Fitbit Charge HR</w:t>
-            </w:r>
-          </w:p>
-        </w:tc>
-        <w:tc>
-          <w:tcPr>
-            <w:tcW w:type="dxa" w:w="1872"/>
-          </w:tcPr>
-          <w:p>
-            <w:r/>
-            <w:r>
-              <w:rPr>
-                <w:sz w:val="18"/>
-              </w:rPr>
-              <w:t>557 students, 255 736 nights</w:t>
-            </w:r>
-          </w:p>
-        </w:tc>
-        <w:tc>
-          <w:tcPr>
-            <w:tcW w:type="dxa" w:w="1872"/>
-          </w:tcPr>
-          <w:p>
-            <w:r/>
-            <w:r>
-              <w:rPr>
-                <w:sz w:val="18"/>
-              </w:rPr>
-              <w:t>None</w:t>
-            </w:r>
-          </w:p>
-        </w:tc>
-        <w:tc>
-          <w:tcPr>
-            <w:tcW w:type="dxa" w:w="1872"/>
-          </w:tcPr>
-          <w:p>
-            <w:r/>
-            <w:r>
-              <w:rPr>
-                <w:sz w:val="18"/>
-              </w:rPr>
-              <w:t>Later-than-usual bedtimes raised RHR into the next day</w:t>
-            </w:r>
-          </w:p>
-        </w:tc>
-      </w:tr>
-      <w:tr>
-        <w:tc>
-          <w:tcPr>
-            <w:tcW w:type="dxa" w:w="1872"/>
-          </w:tcPr>
-          <w:p>
-            <w:r/>
-            <w:r>
-              <w:rPr>
-                <w:sz w:val="18"/>
-              </w:rPr>
-              <w:t>Hruska et al (2020)</w:t>
-            </w:r>
-            <w:r>
-              <w:rPr>
-                <w:sz w:val="18"/>
-                <w:vertAlign w:val="superscript"/>
-              </w:rPr>
-              <w:t>22</w:t>
-            </w:r>
-          </w:p>
-        </w:tc>
-        <w:tc>
-          <w:tcPr>
-            <w:tcW w:type="dxa" w:w="1872"/>
-          </w:tcPr>
-          <w:p>
-            <w:r/>
-            <w:r>
-              <w:rPr>
-                <w:sz w:val="18"/>
-              </w:rPr>
-              <w:t>Consumer wrist device</w:t>
-            </w:r>
-          </w:p>
-        </w:tc>
-        <w:tc>
-          <w:tcPr>
-            <w:tcW w:type="dxa" w:w="1872"/>
-          </w:tcPr>
-          <w:p>
-            <w:r/>
-            <w:r>
-              <w:rPr>
-                <w:sz w:val="18"/>
-              </w:rPr>
-              <w:t>54 workers</w:t>
-            </w:r>
-          </w:p>
-        </w:tc>
-        <w:tc>
-          <w:tcPr>
-            <w:tcW w:type="dxa" w:w="1872"/>
-          </w:tcPr>
-          <w:p>
-            <w:r/>
-            <w:r>
-              <w:rPr>
-                <w:sz w:val="18"/>
-              </w:rPr>
-              <w:t>Weekly stress</w:t>
-            </w:r>
-          </w:p>
-        </w:tc>
-        <w:tc>
-          <w:tcPr>
-            <w:tcW w:type="dxa" w:w="1872"/>
-          </w:tcPr>
-          <w:p>
-            <w:r/>
-            <w:r>
-              <w:rPr>
-                <w:sz w:val="18"/>
-              </w:rPr>
-              <w:t>Stress-heart rate link weakened before a vacation</w:t>
-            </w:r>
-          </w:p>
-        </w:tc>
-      </w:tr>
     </w:tbl>
     <w:p>
       <w:r>
@@ -1904,7 +1692,7 @@
         <w:rPr>
           <w:vertAlign w:val="superscript"/>
         </w:rPr>
-        <w:t>36</w:t>
+        <w:t>29</w:t>
       </w:r>
       <w:r>
         <w:t xml:space="preserve"> Adherence is a concern in clinical staff: when 20 emergency nurses and residents were given WHOOP bands for 6 weeks, only half wore them consistently, and several preferred more familiar devices.</w:t>
@@ -1913,7 +1701,7 @@
         <w:rPr>
           <w:vertAlign w:val="superscript"/>
         </w:rPr>
-        <w:t>41</w:t>
+        <w:t>34</w:t>
       </w:r>
     </w:p>
     <w:p>
@@ -1930,7 +1718,7 @@
         <w:rPr>
           <w:vertAlign w:val="superscript"/>
         </w:rPr>
-        <w:t>13</w:t>
+        <w:t>12</w:t>
       </w:r>
       <w:r>
         <w:t xml:space="preserve"> In 1290 adults from the Northern Finland Birth Cohort, those with depression and anxiety symptoms had higher night-time heart rate, lower RMSSD during sleep, and less REM and deep sleep.</w:t>
@@ -1939,7 +1727,7 @@
         <w:rPr>
           <w:vertAlign w:val="superscript"/>
         </w:rPr>
-        <w:t>37</w:t>
+        <w:t>30</w:t>
       </w:r>
       <w:r>
         <w:t xml:space="preserve"> In a pilot study of 25 nurses, a sleep-aid kit shortened self-reported sleep latency, but Oura-measured HRV did not change.</w:t>
@@ -1948,7 +1736,7 @@
         <w:rPr>
           <w:vertAlign w:val="superscript"/>
         </w:rPr>
-        <w:t>39</w:t>
+        <w:t>32</w:t>
       </w:r>
     </w:p>
     <w:p>
@@ -1965,7 +1753,7 @@
         <w:rPr>
           <w:vertAlign w:val="superscript"/>
         </w:rPr>
-        <w:t>40</w:t>
+        <w:t>33</w:t>
       </w:r>
     </w:p>
     <w:p>
@@ -1976,22 +1764,22 @@
         <w:t>Fitbit and Apple Watch.</w:t>
       </w:r>
       <w:r>
-        <w:t xml:space="preserve"> Fitbit devices have been used to link irregular sleep to poorer mood in physicians in training</w:t>
+        <w:t xml:space="preserve"> Fitbit devices have been used to link short and irregular sleep to poorer mood in physicians in training</w:t>
       </w:r>
       <w:r>
         <w:rPr>
           <w:vertAlign w:val="superscript"/>
         </w:rPr>
-        <w:t>11</w:t>
-      </w:r>
-      <w:r>
-        <w:t xml:space="preserve"> and later-than-usual bedtimes to higher resting heart rate in students.</w:t>
+        <w:t>10</w:t>
+      </w:r>
+      <w:r>
+        <w:t xml:space="preserve"> and to track rising sleeping heart rate in medical faculty.</w:t>
       </w:r>
       <w:r>
         <w:rPr>
           <w:vertAlign w:val="superscript"/>
         </w:rPr>
-        <w:t>45</w:t>
+        <w:t>17</w:t>
       </w:r>
       <w:r>
         <w:t xml:space="preserve"> In 329 health care workers wearing Apple Watches, wearable data predicted psychological resilience only weakly.</w:t>
@@ -2000,7 +1788,7 @@
         <w:rPr>
           <w:vertAlign w:val="superscript"/>
         </w:rPr>
-        <w:t>43</w:t>
+        <w:t>36</w:t>
       </w:r>
     </w:p>
     <w:p>
@@ -2019,7 +1807,7 @@
         <w:rPr>
           <w:vertAlign w:val="superscript"/>
         </w:rPr>
-        <w:t>38</w:t>
+        <w:t>31</w:t>
       </w:r>
       <w:r>
         <w:t xml:space="preserve"> I did not identify any study that used a recovery score as an outcome in burnout research. For this reason, raw overnight RMSSD and resting heart rate are more appropriate primary outcomes, with recovery scores treated as secondary measures.</w:t>
@@ -2041,7 +1829,7 @@
         <w:rPr>
           <w:vertAlign w:val="superscript"/>
         </w:rPr>
-        <w:t>46</w:t>
+        <w:t>38</w:t>
       </w:r>
       <w:r>
         <w:t xml:space="preserve"> Fitbit devices performed as well as or better than research actigraphy, whereas Garmin devices performed worse.</w:t>
@@ -2050,7 +1838,7 @@
         <w:rPr>
           <w:vertAlign w:val="superscript"/>
         </w:rPr>
-        <w:t>47</w:t>
+        <w:t>39</w:t>
       </w:r>
       <w:r>
         <w:t xml:space="preserve"> For overnight heart rate and HRV measured against electrocardiography, Oura rings showed the highest accuracy, WHOOP was moderately accurate, and Garmin and Polar were less accurate.</w:t>
@@ -2059,7 +1847,7 @@
         <w:rPr>
           <w:vertAlign w:val="superscript"/>
         </w:rPr>
-        <w:t>48</w:t>
+        <w:t>40</w:t>
       </w:r>
       <w:r>
         <w:t xml:space="preserve"> Apple Watch reports HRV as the standard deviation of normal-to-normal intervals (SDNN) rather than RMSSD, so its values cannot be pooled directly with those from other devices.</w:t>
@@ -2157,7 +1945,7 @@
         <w:rPr>
           <w:vertAlign w:val="superscript"/>
         </w:rPr>
-        <w:t>18</w:t>
+        <w:t>16</w:t>
       </w:r>
       <w:r>
         <w:t xml:space="preserve"> I did not identify any study that examined burnout in relation to overnight HRV and sleep recorded by women's own wearable devices.</w:t>
@@ -2194,7 +1982,7 @@
         <w:rPr>
           <w:vertAlign w:val="superscript"/>
         </w:rPr>
-        <w:t>20,21</w:t>
+        <w:t>18</w:t>
       </w:r>
       <w:r>
         <w:t xml:space="preserve"> but none has examined whether burnout reduces this recovery.</w:t>
@@ -2217,7 +2005,7 @@
         <w:rPr>
           <w:vertAlign w:val="superscript"/>
         </w:rPr>
-        <w:t>33,34</w:t>
+        <w:t>27</w:t>
       </w:r>
     </w:p>
     <w:p>
@@ -2231,13 +2019,13 @@
         <w:t>Burnout and depression are seldom separated.</w:t>
       </w:r>
       <w:r>
-        <w:t xml:space="preserve"> HRV appears to track exhaustion, which is shared by both conditions.</w:t>
+        <w:t xml:space="preserve"> Few studies measure both; in one that did, HRV was related to burnout severity but showed little association with depressive symptoms.</w:t>
       </w:r>
       <w:r>
         <w:rPr>
           <w:vertAlign w:val="superscript"/>
         </w:rPr>
-        <w:t>16</w:t>
+        <w:t>15</w:t>
       </w:r>
     </w:p>
     <w:p>
@@ -2257,7 +2045,7 @@
         <w:rPr>
           <w:vertAlign w:val="superscript"/>
         </w:rPr>
-        <w:t>38</w:t>
+        <w:t>31</w:t>
       </w:r>
     </w:p>
     <w:p>
@@ -2276,7 +2064,7 @@
         <w:rPr>
           <w:vertAlign w:val="superscript"/>
         </w:rPr>
-        <w:t>26</w:t>
+        <w:t>21</w:t>
       </w:r>
       <w:r>
         <w:t xml:space="preserve"> Outcomes would be nightly RMSSD, resting heart rate, and sleep duration, efficiency, and regularity over at least 30 days, ideally including one break period. Depression, age, body mass index, menstrual cycle phase, contraceptive use, shift work, alcohol and caffeine intake, and physical activity would be measured as covariates. Based on the literature, I propose three hypotheses:</w:t>
@@ -2357,7 +2145,7 @@
         <w:rPr>
           <w:i w:val="0"/>
         </w:rPr>
-        <w:t>World Health Organization. Burn-out an "occupational phenomenon": International Classification of Diseases. Published May 28, 2019. Accessed October 7, 2026. https://www.who.int/news/item/28-05-2019-burn-out-an-occupational-phenomenon-international-classification-of-diseases</w:t>
+        <w:t>World Health Organization. QD85 Burnout. In: ICD-11 for Mortality and Morbidity Statistics. Version 2024-01. Accessed October 7, 2026. https://icd.who.int/browse/2024-01/mms/en#129180281</w:t>
       </w:r>
     </w:p>
     <w:p>
@@ -2534,19 +2322,19 @@
         <w:rPr>
           <w:i w:val="0"/>
         </w:rPr>
-        <w:t xml:space="preserve">Rudman A, Arborelius L, Dahlgren A, Finnes A, Gustavsson P. Consequences of early career nurse burnout: a prospective long-term follow-up on cognitive functions, depressive symptoms, and insomnia. </w:t>
+        <w:t xml:space="preserve">Świtaj P, Baka Ł, Kapica Ł, Bugajska J, Januszczak J, Sienkiewicz-Jarosz H. Insomnia mediates the longitudinal association between loneliness and burnout among nurses. </w:t>
       </w:r>
       <w:r>
         <w:rPr>
           <w:i/>
         </w:rPr>
-        <w:t>EClinicalMedicine</w:t>
+        <w:t>Sci Rep</w:t>
       </w:r>
       <w:r>
         <w:rPr>
           <w:i w:val="0"/>
         </w:rPr>
-        <w:t>. 2020;27:100565. doi:10.1016/j.eclinm.2020.100565</w:t>
+        <w:t>. 2025;15(1):25384. doi:10.1038/s41598-025-11264-8</w:t>
       </w:r>
     </w:p>
     <w:p>
@@ -2561,19 +2349,19 @@
         <w:rPr>
           <w:i w:val="0"/>
         </w:rPr>
-        <w:t xml:space="preserve">Świtaj P, Baka Ł, Kapica Ł, Bugajska J, Januszczak J, Sienkiewicz-Jarosz H. Insomnia mediates the longitudinal association between loneliness and burnout among nurses. </w:t>
+        <w:t xml:space="preserve">Frick S, Smolders K, van der Meij L, Demerouti E, de Kort Y. The bidirectional relationship between sleep and daily burnout-related experiences: self-report vs actigraphy-derived measures. </w:t>
       </w:r>
       <w:r>
         <w:rPr>
           <w:i/>
         </w:rPr>
-        <w:t>Sci Rep</w:t>
+        <w:t>Sleep Health</w:t>
       </w:r>
       <w:r>
         <w:rPr>
           <w:i w:val="0"/>
         </w:rPr>
-        <w:t>. 2025;15(1):25384. doi:10.1038/s41598-025-11264-8</w:t>
+        <w:t>. 2025;11(3):382-389. doi:10.1016/j.sleh.2025.03.007</w:t>
       </w:r>
     </w:p>
     <w:p>
@@ -2588,19 +2376,19 @@
         <w:rPr>
           <w:i w:val="0"/>
         </w:rPr>
-        <w:t xml:space="preserve">Frick S, Smolders K, van der Meij L, Demerouti E, de Kort Y. The bidirectional relationship between sleep and daily burnout-related experiences: self-report vs actigraphy-derived measures. </w:t>
+        <w:t xml:space="preserve">Fang Y, Forger DB, Frank E, Sen S, Goldstein C. Day-to-day variability in sleep parameters and depression risk: a prospective cohort study of training physicians. </w:t>
       </w:r>
       <w:r>
         <w:rPr>
           <w:i/>
         </w:rPr>
-        <w:t>Sleep Health</w:t>
+        <w:t>NPJ Digit Med</w:t>
       </w:r>
       <w:r>
         <w:rPr>
           <w:i w:val="0"/>
         </w:rPr>
-        <w:t>. 2025;11(3):382-389. doi:10.1016/j.sleh.2025.03.007</w:t>
+        <w:t>. 2021;4(1):28. doi:10.1038/s41746-021-00400-z</w:t>
       </w:r>
     </w:p>
     <w:p>
@@ -2615,19 +2403,19 @@
         <w:rPr>
           <w:i w:val="0"/>
         </w:rPr>
-        <w:t xml:space="preserve">Fang Y, Forger DB, Frank E, Sen S, Goldstein C. Day-to-day variability in sleep parameters and depression risk: a prospective cohort study of training physicians. </w:t>
+        <w:t xml:space="preserve">Sy JRT, Brombach RK, Leete JJ, et al. Longitudinal associations of sleep midpoint and sleep midpoint variability with the mental health of young adult college students. </w:t>
       </w:r>
       <w:r>
         <w:rPr>
           <w:i/>
         </w:rPr>
-        <w:t>NPJ Digit Med</w:t>
+        <w:t>Chronobiol Int</w:t>
       </w:r>
       <w:r>
         <w:rPr>
           <w:i w:val="0"/>
         </w:rPr>
-        <w:t>. 2021;4(1):28. doi:10.1038/s41746-021-00400-z</w:t>
+        <w:t>. 2026;43(9):1424-1430. doi:10.1080/07420528.2026.2671355</w:t>
       </w:r>
     </w:p>
     <w:p>
@@ -2642,19 +2430,19 @@
         <w:rPr>
           <w:i w:val="0"/>
         </w:rPr>
-        <w:t xml:space="preserve">Veeramachaneni K, Slavish DC, Dietch JR, Kelly K, Taylor DJ. Intraindividual variability in sleep and perceived stress in young adults. </w:t>
+        <w:t xml:space="preserve">Bourassa KA, Lamichhane B, Bartek N, Bautista C, Sano A, Madan A. Objective biobehavioral measures reflect burnout states and temporal changes in a nursing population: a prospective observational assessment. </w:t>
       </w:r>
       <w:r>
         <w:rPr>
           <w:i/>
         </w:rPr>
-        <w:t>Sleep Health</w:t>
+        <w:t>Nurs Rep</w:t>
       </w:r>
       <w:r>
         <w:rPr>
           <w:i w:val="0"/>
         </w:rPr>
-        <w:t>. 2019;5(6):572-579. doi:10.1016/j.sleh.2019.07.009</w:t>
+        <w:t>. 2026;16(1):36. doi:10.3390/nursrep16010036</w:t>
       </w:r>
     </w:p>
     <w:p>
@@ -2669,19 +2457,19 @@
         <w:rPr>
           <w:i w:val="0"/>
         </w:rPr>
-        <w:t xml:space="preserve">Bourassa KA, Lamichhane B, Bartek N, Bautista C, Sano A, Madan A. Objective biobehavioral measures reflect burnout states and temporal changes in a nursing population: a prospective observational assessment. </w:t>
+        <w:t xml:space="preserve">Kane L, Powell D, Martin KR, Rees C, Curran J, Ball D. Continuous heart rate variability monitoring, stress and recovery in doctors: a systematic review and meta-analysis. </w:t>
       </w:r>
       <w:r>
         <w:rPr>
           <w:i/>
         </w:rPr>
-        <w:t>Nurs Rep</w:t>
+        <w:t>Occup Med (Lond)</w:t>
       </w:r>
       <w:r>
         <w:rPr>
           <w:i w:val="0"/>
         </w:rPr>
-        <w:t>. 2026;16(1):36. doi:10.3390/nursrep16010036</w:t>
+        <w:t>. 2025;75(9):630-639. doi:10.1093/occmed/kqaf101</w:t>
       </w:r>
     </w:p>
     <w:p>
@@ -2696,19 +2484,19 @@
         <w:rPr>
           <w:i w:val="0"/>
         </w:rPr>
-        <w:t xml:space="preserve">Järvelin-Pasanen S, Sinikallio S, Tarvainen MP. Heart rate variability and occupational stress: systematic review. </w:t>
+        <w:t xml:space="preserve">Lee HS, Lee T, Kwon K, Ahn WS, Lee SH. Occupational stress in the neuroticism-burnout link: an exploratory examination of physiological contributions. </w:t>
       </w:r>
       <w:r>
         <w:rPr>
           <w:i/>
         </w:rPr>
-        <w:t>Ind Health</w:t>
+        <w:t>Clin Psychopharmacol Neurosci</w:t>
       </w:r>
       <w:r>
         <w:rPr>
           <w:i w:val="0"/>
         </w:rPr>
-        <w:t>. 2018;56(6):500-511. doi:10.2486/indhealth.2017-0190</w:t>
+        <w:t>. 2026;24(3):570-579. doi:10.9758/cpn.25.1377</w:t>
       </w:r>
     </w:p>
     <w:p>
@@ -2723,19 +2511,19 @@
         <w:rPr>
           <w:i w:val="0"/>
         </w:rPr>
-        <w:t xml:space="preserve">Lennartsson AK, Jonsdottir I, Sjörs A. Low heart rate variability in patients with clinical burnout. </w:t>
+        <w:t xml:space="preserve">Turner W, La Marca R, Infanger D, et al. Heart rate variability across recording conditions: associations with depression and burnout in inpatients with stress-related disorders. </w:t>
       </w:r>
       <w:r>
         <w:rPr>
           <w:i/>
         </w:rPr>
-        <w:t>Int J Psychophysiol</w:t>
+        <w:t>J Psychosom Res</w:t>
       </w:r>
       <w:r>
         <w:rPr>
           <w:i w:val="0"/>
         </w:rPr>
-        <w:t>. 2016;110:171-178. doi:10.1016/j.ijpsycho.2016.08.005</w:t>
+        <w:t>. 2026;207:112674. doi:10.1016/j.jpsychores.2026.112674</w:t>
       </w:r>
     </w:p>
     <w:p>
@@ -2750,19 +2538,19 @@
         <w:rPr>
           <w:i w:val="0"/>
         </w:rPr>
-        <w:t xml:space="preserve">Kanthak MK, Stalder T, Hill LK, Thayer JF, Penz M, Kirschbaum C. Autonomic dysregulation in burnout and depression: evidence for the central role of exhaustion. </w:t>
+        <w:t xml:space="preserve">Böckelmann I, Hartung J, Darius S, Sammito S, Thielmann B. Heart rate variability and burnout risk among healthy employees in jobs involving interaction with others. </w:t>
       </w:r>
       <w:r>
         <w:rPr>
           <w:i/>
         </w:rPr>
-        <w:t>Scand J Work Environ Health</w:t>
+        <w:t>Front Physiol</w:t>
       </w:r>
       <w:r>
         <w:rPr>
           <w:i w:val="0"/>
         </w:rPr>
-        <w:t>. 2017;43(5):475-484. doi:10.5271/sjweh.3647</w:t>
+        <w:t>. 2026;17:1908141. doi:10.3389/fphys.2026.1908141</w:t>
       </w:r>
     </w:p>
     <w:p>
@@ -2777,19 +2565,19 @@
         <w:rPr>
           <w:i w:val="0"/>
         </w:rPr>
-        <w:t xml:space="preserve">Turner W, La Marca R, Infanger D, et al. Heart rate variability across recording conditions: associations with depression and burnout in inpatients with stress-related disorders. </w:t>
+        <w:t xml:space="preserve">Gilin DA, Anderson GG, Etezad S, Lee-Baggley D, Cooper AM, Preston RJ. Impact of a wellness leadership intervention on the empathy, burnout, and resting heart rate of medical faculty. </w:t>
       </w:r>
       <w:r>
         <w:rPr>
           <w:i/>
         </w:rPr>
-        <w:t>J Psychosom Res</w:t>
+        <w:t>Mayo Clin Proc Innov Qual Outcomes</w:t>
       </w:r>
       <w:r>
         <w:rPr>
           <w:i w:val="0"/>
         </w:rPr>
-        <w:t>. 2026;207:112674. doi:10.1016/j.jpsychores.2026.112674</w:t>
+        <w:t>. 2023;7(6):545-555. doi:10.1016/j.mayocpiqo.2023.09.005</w:t>
       </w:r>
     </w:p>
     <w:p>
@@ -2804,19 +2592,19 @@
         <w:rPr>
           <w:i w:val="0"/>
         </w:rPr>
-        <w:t xml:space="preserve">Böckelmann I, Hartung J, Darius S, Sammito S, Thielmann B. Heart rate variability and burnout risk among healthy employees in jobs involving interaction with others. </w:t>
+        <w:t xml:space="preserve">Hübner M, Lechleitner P, Neumayr G. Effects of a one-week vacation with various activity programs on well-being, heart rate variability, and sleep quality in healthy vacationers: an open comparative study. </w:t>
       </w:r>
       <w:r>
         <w:rPr>
           <w:i/>
         </w:rPr>
-        <w:t>Front Physiol</w:t>
+        <w:t>BMC Public Health</w:t>
       </w:r>
       <w:r>
         <w:rPr>
           <w:i w:val="0"/>
         </w:rPr>
-        <w:t>. 2026;17:1908141. doi:10.3389/fphys.2026.1908141</w:t>
+        <w:t>. 2022;22(1):2435. doi:10.1186/s12889-022-14838-7</w:t>
       </w:r>
     </w:p>
     <w:p>
@@ -2831,19 +2619,19 @@
         <w:rPr>
           <w:i w:val="0"/>
         </w:rPr>
-        <w:t xml:space="preserve">Gilin DA, Anderson GG, Etezad S, Lee-Baggley D, Cooper AM, Preston RJ. Impact of a wellness leadership intervention on the empathy, burnout, and resting heart rate of medical faculty. </w:t>
+        <w:t xml:space="preserve">Chen Y, Xu K, Zhao Y, et al. The impact of school life and holidays on sleep and physical activity patterns in junior high school students: a small-sample longitudinal study using wearable devices. </w:t>
       </w:r>
       <w:r>
         <w:rPr>
           <w:i/>
         </w:rPr>
-        <w:t>Mayo Clin Proc Innov Qual Outcomes</w:t>
+        <w:t>Front Public Health</w:t>
       </w:r>
       <w:r>
         <w:rPr>
           <w:i w:val="0"/>
         </w:rPr>
-        <w:t>. 2023;7(6):545-555. doi:10.1016/j.mayocpiqo.2023.09.005</w:t>
+        <w:t>. 2026;14:1833198. doi:10.3389/fpubh.2026.1833198</w:t>
       </w:r>
     </w:p>
     <w:p>
@@ -2858,19 +2646,19 @@
         <w:rPr>
           <w:i w:val="0"/>
         </w:rPr>
-        <w:t xml:space="preserve">Hübner M, Lechleitner P, Neumayr G. Effects of a one-week vacation with various activity programs on well-being, heart rate variability, and sleep quality in healthy vacationers: an open comparative study. </w:t>
+        <w:t xml:space="preserve">Kazlauskas E, Dumarkaite A, Gelezelyte O, Nomeikaite A, Zelviene P. Validation of the Recovery Experience Questionnaire in a Lithuanian healthcare personnel. </w:t>
       </w:r>
       <w:r>
         <w:rPr>
           <w:i/>
         </w:rPr>
-        <w:t>BMC Public Health</w:t>
+        <w:t>Int J Environ Res Public Health</w:t>
       </w:r>
       <w:r>
         <w:rPr>
           <w:i w:val="0"/>
         </w:rPr>
-        <w:t>. 2022;22(1):2435. doi:10.1186/s12889-022-14838-7</w:t>
+        <w:t>. 2023;20(3):2734. doi:10.3390/ijerph20032734</w:t>
       </w:r>
     </w:p>
     <w:p>
@@ -2885,19 +2673,19 @@
         <w:rPr>
           <w:i w:val="0"/>
         </w:rPr>
-        <w:t xml:space="preserve">Pratap A, Steinhubl S, Neto EC, et al. Changes in continuous, long-term heart rate variability and individualized physiological responses to wellness and vacation interventions using a wearable sensor. </w:t>
+        <w:t xml:space="preserve">Oluwadiya KS, Owoeye OK, Adeoti AO. Evaluating the factor structure, reliability and validity of the Copenhagen Burnout Inventory-Student Survey (CBI-SS) among faculty of arts students of Ekiti State University, Ado-Ekiti, Nigeria. </w:t>
       </w:r>
       <w:r>
         <w:rPr>
           <w:i/>
         </w:rPr>
-        <w:t>Front Cardiovasc Med</w:t>
+        <w:t>Sci Rep</w:t>
       </w:r>
       <w:r>
         <w:rPr>
           <w:i w:val="0"/>
         </w:rPr>
-        <w:t>. 2020;7:120. doi:10.3389/fcvm.2020.00120</w:t>
+        <w:t>. 2024;14(1):10476. doi:10.1038/s41598-024-61310-0</w:t>
       </w:r>
     </w:p>
     <w:p>
@@ -2912,19 +2700,19 @@
         <w:rPr>
           <w:i w:val="0"/>
         </w:rPr>
-        <w:t xml:space="preserve">Hruska B, Pressman SD, Bendinskas K, Gump BB. Do vacations alter the connection between stress and cardiovascular activity? The effects of a planned vacation on the relationship between weekly stress and ambulatory heart rate. </w:t>
+        <w:t xml:space="preserve">Alawad A, Merghani T, Chowdhury N, Hisham HA. Heart rate variability and autonomic function in health professions students: associations with academic stress and lifestyle factors. </w:t>
       </w:r>
       <w:r>
         <w:rPr>
           <w:i/>
         </w:rPr>
-        <w:t>Psychol Health</w:t>
+        <w:t>Physiol Rep</w:t>
       </w:r>
       <w:r>
         <w:rPr>
           <w:i w:val="0"/>
         </w:rPr>
-        <w:t>. 2020;35(8):984-999. doi:10.1080/08870446.2019.1687699</w:t>
+        <w:t>. 2026;14(13):e71012. doi:10.14814/phy2.71012</w:t>
       </w:r>
     </w:p>
     <w:p>
@@ -2939,19 +2727,19 @@
         <w:rPr>
           <w:i w:val="0"/>
         </w:rPr>
-        <w:t xml:space="preserve">Maskevich S, Cassanet A, Allen NB, Trinder J, Bei B. Sleep and stress in adolescents: the roles of pre-sleep arousal and coping during school and vacation. </w:t>
+        <w:t xml:space="preserve">Sathyanarayana A, Amin OB, An J, Onnela JP. Examining the use of consumer wearable devices and digital tools for stress measurement in college students: scoping review of methods. </w:t>
       </w:r>
       <w:r>
         <w:rPr>
           <w:i/>
         </w:rPr>
-        <w:t>Sleep Med</w:t>
+        <w:t>JMIR Mhealth Uhealth</w:t>
       </w:r>
       <w:r>
         <w:rPr>
           <w:i w:val="0"/>
         </w:rPr>
-        <w:t>. 2020;66:130-138. doi:10.1016/j.sleep.2019.10.006</w:t>
+        <w:t>. 2026;14:e64144. doi:10.2196/64144</w:t>
       </w:r>
     </w:p>
     <w:p>
@@ -2966,19 +2754,19 @@
         <w:rPr>
           <w:i w:val="0"/>
         </w:rPr>
-        <w:t xml:space="preserve">Chen Y, Xu K, Zhao Y, et al. The impact of school life and holidays on sleep and physical activity patterns in junior high school students: a small-sample longitudinal study using wearable devices. </w:t>
+        <w:t xml:space="preserve">Garcia-Ceja E, Alvarado-Uribe J, Escamilla-Ambrosio PJ, et al. A dataset of university students' stress and anxiety levels based on questionnaires and wearable sensors. </w:t>
       </w:r>
       <w:r>
         <w:rPr>
           <w:i/>
         </w:rPr>
-        <w:t>Front Public Health</w:t>
+        <w:t>Sci Data</w:t>
       </w:r>
       <w:r>
         <w:rPr>
           <w:i w:val="0"/>
         </w:rPr>
-        <w:t>. 2026;14:1833198. doi:10.3389/fpubh.2026.1833198</w:t>
+        <w:t>. 2026;13(1):732. doi:10.1038/s41597-026-07085-7</w:t>
       </w:r>
     </w:p>
     <w:p>
@@ -2993,19 +2781,19 @@
         <w:rPr>
           <w:i w:val="0"/>
         </w:rPr>
-        <w:t xml:space="preserve">Kazlauskas E, Dumarkaite A, Gelezelyte O, Nomeikaite A, Zelviene P. Validation of the Recovery Experience Questionnaire in a Lithuanian healthcare personnel. </w:t>
+        <w:t xml:space="preserve">Thakur S, Chauhan V, Galwankar S, et al. Gender disparities and burnout among emergency physicians: a systematic review by the World Academic Council of Emergency Medicine-Female Leadership Academy for Medical Excellence. </w:t>
       </w:r>
       <w:r>
         <w:rPr>
           <w:i/>
         </w:rPr>
-        <w:t>Int J Environ Res Public Health</w:t>
+        <w:t>West J Emerg Med</w:t>
       </w:r>
       <w:r>
         <w:rPr>
           <w:i w:val="0"/>
         </w:rPr>
-        <w:t>. 2023;20(3):2734. doi:10.3390/ijerph20032734</w:t>
+        <w:t>. 2025;26(2):338-346. doi:10.5811/westjem.29331</w:t>
       </w:r>
     </w:p>
     <w:p>
@@ -3020,19 +2808,19 @@
         <w:rPr>
           <w:i w:val="0"/>
         </w:rPr>
-        <w:t xml:space="preserve">Oluwadiya KS, Owoeye OK, Adeoti AO. Evaluating the factor structure, reliability and validity of the Copenhagen Burnout Inventory-Student Survey (CBI-SS) among faculty of arts students of Ekiti State University, Ado-Ekiti, Nigeria. </w:t>
+        <w:t xml:space="preserve">Calderón-García A, Álvarez-Gallardo E, Belinchón-deMiguel P, Clemente-Suárez VJ. Gender differences in autonomic and psychological stress responses among educators: a heart rate variability and psychological assessment study. </w:t>
       </w:r>
       <w:r>
         <w:rPr>
           <w:i/>
         </w:rPr>
-        <w:t>Sci Rep</w:t>
+        <w:t>Front Psychol</w:t>
       </w:r>
       <w:r>
         <w:rPr>
           <w:i w:val="0"/>
         </w:rPr>
-        <w:t>. 2024;14(1):10476. doi:10.1038/s41598-024-61310-0</w:t>
+        <w:t>. 2024;15:1422709. doi:10.3389/fpsyg.2024.1422709</w:t>
       </w:r>
     </w:p>
     <w:p>
@@ -3047,19 +2835,19 @@
         <w:rPr>
           <w:i w:val="0"/>
         </w:rPr>
-        <w:t xml:space="preserve">Hammoud S, Karam R, Mourad R, Saad I, Kurdi M. Stress and heart rate variability during university final examination among Lebanese students. </w:t>
+        <w:t xml:space="preserve">de Jager E, Caulfield B, Angelidi E, MacNamee B, Holden S. Wearable-derived heart rate variability across the menstrual cycle, hormonal contraceptive use, and reproductive life stages in females: a living systematic review. </w:t>
       </w:r>
       <w:r>
         <w:rPr>
           <w:i/>
         </w:rPr>
-        <w:t>Behav Sci (Basel)</w:t>
+        <w:t>Sports Med</w:t>
       </w:r>
       <w:r>
         <w:rPr>
           <w:i w:val="0"/>
         </w:rPr>
-        <w:t>. 2018;9(1):3. doi:10.3390/bs9010003</w:t>
+        <w:t>. 2026;56(5):1153-1173. doi:10.1007/s40279-025-02388-y</w:t>
       </w:r>
     </w:p>
     <w:p>
@@ -3074,19 +2862,19 @@
         <w:rPr>
           <w:i w:val="0"/>
         </w:rPr>
-        <w:t xml:space="preserve">Phillips AJK, Clerx WM, O'Brien CS, et al. Irregular sleep/wake patterns are associated with poorer academic performance and delayed circadian and sleep/wake timing. </w:t>
+        <w:t xml:space="preserve">Alzueta E, de Zambotti M, Javitz H, et al. Tracking sleep, temperature, heart rate, and daily symptoms across the menstrual cycle with the Oura Ring in healthy women. </w:t>
       </w:r>
       <w:r>
         <w:rPr>
           <w:i/>
         </w:rPr>
-        <w:t>Sci Rep</w:t>
+        <w:t>Int J Womens Health</w:t>
       </w:r>
       <w:r>
         <w:rPr>
           <w:i w:val="0"/>
         </w:rPr>
-        <w:t>. 2017;7(1):3216. doi:10.1038/s41598-017-03171-4</w:t>
+        <w:t>. 2022;14:491-503. doi:10.2147/ijwh.s341917</w:t>
       </w:r>
     </w:p>
     <w:p>
@@ -3101,19 +2889,19 @@
         <w:rPr>
           <w:i w:val="0"/>
         </w:rPr>
-        <w:t xml:space="preserve">Sathyanarayana A, Amin OB, An J, Onnela JP. Examining the use of consumer wearable devices and digital tools for stress measurement in college students: scoping review of methods. </w:t>
+        <w:t xml:space="preserve">Holmes KE, Kim J, Fielding F, Zeitzer JM, von Hippel W. Four core circadian behaviors that improve cardiorespiratory fitness through consistent sleep. </w:t>
       </w:r>
       <w:r>
         <w:rPr>
           <w:i/>
         </w:rPr>
-        <w:t>JMIR Mhealth Uhealth</w:t>
+        <w:t>Sleep</w:t>
       </w:r>
       <w:r>
         <w:rPr>
           <w:i w:val="0"/>
         </w:rPr>
-        <w:t>. 2026;14:e64144. doi:10.2196/64144</w:t>
+        <w:t>. 2026;49(2):zsaf318. doi:10.1093/sleep/zsaf318</w:t>
       </w:r>
     </w:p>
     <w:p>
@@ -3128,19 +2916,19 @@
         <w:rPr>
           <w:i w:val="0"/>
         </w:rPr>
-        <w:t xml:space="preserve">Garcia-Ceja E, Alvarado-Uribe J, Escamilla-Ambrosio PJ, et al. A dataset of university students' stress and anxiety levels based on questionnaires and wearable sensors. </w:t>
+        <w:t xml:space="preserve">Azadifar S, Sameh A, Nauha L, Kärmeniemi M, Niemelä M, Farrahi V. Severity of depression and anxiety symptoms is reflected in physiological and behavioral metrics collected from a consumer-grade wearable ring. </w:t>
       </w:r>
       <w:r>
         <w:rPr>
           <w:i/>
         </w:rPr>
-        <w:t>Sci Data</w:t>
+        <w:t>BMC Med</w:t>
       </w:r>
       <w:r>
         <w:rPr>
           <w:i w:val="0"/>
         </w:rPr>
-        <w:t>. 2026;13(1):732. doi:10.1038/s41597-026-07085-7</w:t>
+        <w:t>. 2026;24(1):532. doi:10.1186/s12916-026-05276-y</w:t>
       </w:r>
     </w:p>
     <w:p>
@@ -3155,19 +2943,19 @@
         <w:rPr>
           <w:i w:val="0"/>
         </w:rPr>
-        <w:t xml:space="preserve">Cañadas-De la Fuente GA, Ortega E, Ramirez-Baena L, De la Fuente-Solana EI, Vargas C, Gómez-Urquiza JL. Gender, marital status, and children as risk factors for burnout in nurses: a meta-analytic study. </w:t>
+        <w:t xml:space="preserve">Perrone K, Earley M, Rosenberg G, Pugh C, Kin C. Physiologic readiness and subjective workload of performing operations: a prospective observational study of attending and trainee surgeons. </w:t>
       </w:r>
       <w:r>
         <w:rPr>
           <w:i/>
         </w:rPr>
-        <w:t>Int J Environ Res Public Health</w:t>
+        <w:t>Am J Surg</w:t>
       </w:r>
       <w:r>
         <w:rPr>
           <w:i w:val="0"/>
         </w:rPr>
-        <w:t>. 2018;15(10):2102. doi:10.3390/ijerph15102102</w:t>
+        <w:t>. 2025;241:116175. doi:10.1016/j.amjsurg.2024.116175</w:t>
       </w:r>
     </w:p>
     <w:p>
@@ -3182,19 +2970,19 @@
         <w:rPr>
           <w:i w:val="0"/>
         </w:rPr>
-        <w:t xml:space="preserve">Koenig J, Thayer JF. Sex differences in healthy human heart rate variability: a meta-analysis. </w:t>
+        <w:t xml:space="preserve">Norful AA, de Jacq K, Zhao J, et al. Exploring longitudinal physiologic stress measurement and sleep quality interventions to improve psychological well-being in nurses: a pilot study. </w:t>
       </w:r>
       <w:r>
         <w:rPr>
           <w:i/>
         </w:rPr>
-        <w:t>Neurosci Biobehav Rev</w:t>
+        <w:t>Health Psychol Behav Med</w:t>
       </w:r>
       <w:r>
         <w:rPr>
           <w:i w:val="0"/>
         </w:rPr>
-        <w:t>. 2016;64:288-310. doi:10.1016/j.neubiorev.2016.03.007</w:t>
+        <w:t>. 2025;13(1):2503376. doi:10.1080/21642850.2025.2503376</w:t>
       </w:r>
     </w:p>
     <w:p>
@@ -3209,19 +2997,19 @@
         <w:rPr>
           <w:i w:val="0"/>
         </w:rPr>
-        <w:t xml:space="preserve">Schmalenberger KM, Eisenlohr-Moul TA, Würth L, et al. A systematic review and meta-analysis of within-person changes in cardiac vagal activity across the menstrual cycle: implications for female health and future studies. </w:t>
+        <w:t xml:space="preserve">Rosenbach H, Itzkovitch A, Gidron Y, Schonberg T. Assessing stress level scores against wearables-driven physiological measurements. </w:t>
       </w:r>
       <w:r>
         <w:rPr>
           <w:i/>
         </w:rPr>
-        <w:t>J Clin Med</w:t>
+        <w:t>Stress Health</w:t>
       </w:r>
       <w:r>
         <w:rPr>
           <w:i w:val="0"/>
         </w:rPr>
-        <w:t>. 2019;8(11):1946. doi:10.3390/jcm8111946</w:t>
+        <w:t>. 2025;41(6):e70125. doi:10.1002/smi.70125</w:t>
       </w:r>
     </w:p>
     <w:p>
@@ -3236,19 +3024,19 @@
         <w:rPr>
           <w:i w:val="0"/>
         </w:rPr>
-        <w:t xml:space="preserve">de Jager E, Caulfield B, Angelidi E, MacNamee B, Holden S. Wearable-derived heart rate variability across the menstrual cycle, hormonal contraceptive use, and reproductive life stages in females: a living systematic review. </w:t>
+        <w:t xml:space="preserve">Agarwal AK, Gonzales R, Scott K, Merchant R. Investigating the feasibility of using a wearable device to measure physiologic health data in emergency nurses and residents: observational cohort study. </w:t>
       </w:r>
       <w:r>
         <w:rPr>
           <w:i/>
         </w:rPr>
-        <w:t>Sports Med</w:t>
+        <w:t>JMIR Form Res</w:t>
       </w:r>
       <w:r>
         <w:rPr>
           <w:i w:val="0"/>
         </w:rPr>
-        <w:t>. 2026;56(5):1153-1173. doi:10.1007/s40279-025-02388-y</w:t>
+        <w:t>. 2024;8:e51569. doi:10.2196/51569</w:t>
       </w:r>
     </w:p>
     <w:p>
@@ -3263,19 +3051,19 @@
         <w:rPr>
           <w:i w:val="0"/>
         </w:rPr>
-        <w:t xml:space="preserve">Alzueta E, de Zambotti M, Javitz H, et al. Tracking sleep, temperature, heart rate, and daily symptoms across the menstrual cycle with the Oura Ring in healthy women. </w:t>
+        <w:t xml:space="preserve">Wilton AR, Sheffield K, Wilkes Q, et al. The Burnout PRedictiOn Using Wearable aNd ArtIficial IntelligEnce (BROWNIE) study: a decentralized digital health protocol to predict burnout in registered nurses. </w:t>
       </w:r>
       <w:r>
         <w:rPr>
           <w:i/>
         </w:rPr>
-        <w:t>Int J Womens Health</w:t>
+        <w:t>BMC Nurs</w:t>
       </w:r>
       <w:r>
         <w:rPr>
           <w:i w:val="0"/>
         </w:rPr>
-        <w:t>. 2022;14:491-503. doi:10.2147/ijwh.s341917</w:t>
+        <w:t>. 2024;23(1):114. doi:10.1186/s12912-024-01711-8</w:t>
       </w:r>
     </w:p>
     <w:p>
@@ -3290,19 +3078,19 @@
         <w:rPr>
           <w:i w:val="0"/>
         </w:rPr>
-        <w:t xml:space="preserve">Holmes KE, Kim J, Fielding F, Zeitzer JM, von Hippel W. Four core circadian behaviors that improve cardiorespiratory fitness through consistent sleep. </w:t>
+        <w:t xml:space="preserve">Hirten RP, Suprun M, Danieletto M, et al. A machine learning approach to determine resilience utilizing wearable device data: analysis of an observational cohort. </w:t>
       </w:r>
       <w:r>
         <w:rPr>
           <w:i/>
         </w:rPr>
-        <w:t>Sleep</w:t>
+        <w:t>JAMIA Open</w:t>
       </w:r>
       <w:r>
         <w:rPr>
           <w:i w:val="0"/>
         </w:rPr>
-        <w:t>. 2026;49(2):zsaf318. doi:10.1093/sleep/zsaf318</w:t>
+        <w:t>. 2023;6(2):ooad029. doi:10.1093/jamiaopen/ooad029</w:t>
       </w:r>
     </w:p>
     <w:p>
@@ -3317,19 +3105,19 @@
         <w:rPr>
           <w:i w:val="0"/>
         </w:rPr>
-        <w:t xml:space="preserve">Azadifar S, Sameh A, Nauha L, Kärmeniemi M, Niemelä M, Farrahi V. Severity of depression and anxiety symptoms is reflected in physiological and behavioral metrics collected from a consumer-grade wearable ring. </w:t>
+        <w:t xml:space="preserve">Sagun S, DeCicco D, Badami V, et al. iSleepFirst: burnout, fatigue, and wearable-tracked sleep deprivation among residents staffing the medical intensive care unit. </w:t>
       </w:r>
       <w:r>
         <w:rPr>
           <w:i/>
         </w:rPr>
-        <w:t>BMC Med</w:t>
+        <w:t>Sleep Breath</w:t>
       </w:r>
       <w:r>
         <w:rPr>
           <w:i w:val="0"/>
         </w:rPr>
-        <w:t>. 2026;24(1):532. doi:10.1186/s12916-026-05276-y</w:t>
+        <w:t>. 2023;27(6):2491-2497. doi:10.1007/s11325-023-02839-8</w:t>
       </w:r>
     </w:p>
     <w:p>
@@ -3344,19 +3132,19 @@
         <w:rPr>
           <w:i w:val="0"/>
         </w:rPr>
-        <w:t xml:space="preserve">Perrone K, Earley M, Rosenberg G, Pugh C, Kin C. Physiologic readiness and subjective workload of performing operations: a prospective observational study of attending and trainee surgeons. </w:t>
+        <w:t xml:space="preserve">Miller DJ, Sargent C, Roach GD. A validation of six wearable devices for estimating sleep, heart rate and heart rate variability in healthy adults. </w:t>
       </w:r>
       <w:r>
         <w:rPr>
           <w:i/>
         </w:rPr>
-        <w:t>Am J Surg</w:t>
+        <w:t>Sensors (Basel)</w:t>
       </w:r>
       <w:r>
         <w:rPr>
           <w:i w:val="0"/>
         </w:rPr>
-        <w:t>. 2025;241:116175. doi:10.1016/j.amjsurg.2024.116175</w:t>
+        <w:t>. 2022;22(16):6317. doi:10.3390/s22166317</w:t>
       </w:r>
     </w:p>
     <w:p>
@@ -3371,19 +3159,19 @@
         <w:rPr>
           <w:i w:val="0"/>
         </w:rPr>
-        <w:t xml:space="preserve">Norful AA, de Jacq K, Zhao J, et al. Exploring longitudinal physiologic stress measurement and sleep quality interventions to improve psychological well-being in nurses: a pilot study. </w:t>
+        <w:t xml:space="preserve">Chinoy ED, Cuellar JA, Huwa KE, et al. Performance of seven consumer sleep-tracking devices compared with polysomnography. </w:t>
       </w:r>
       <w:r>
         <w:rPr>
           <w:i/>
         </w:rPr>
-        <w:t>Health Psychol Behav Med</w:t>
+        <w:t>Sleep</w:t>
       </w:r>
       <w:r>
         <w:rPr>
           <w:i w:val="0"/>
         </w:rPr>
-        <w:t>. 2025;13(1):2503376. doi:10.1080/21642850.2025.2503376</w:t>
+        <w:t>. 2021;44(5):zsaa291. doi:10.1093/sleep/zsaa291</w:t>
       </w:r>
     </w:p>
     <w:p>
@@ -3392,222 +3180,6 @@
       </w:pPr>
       <w:r>
         <w:t>40.</w:t>
-        <w:tab/>
-      </w:r>
-      <w:r>
-        <w:rPr>
-          <w:i w:val="0"/>
-        </w:rPr>
-        <w:t xml:space="preserve">Rosenbach H, Itzkovitch A, Gidron Y, Schonberg T. Assessing stress level scores against wearables-driven physiological measurements. </w:t>
-      </w:r>
-      <w:r>
-        <w:rPr>
-          <w:i/>
-        </w:rPr>
-        <w:t>Stress Health</w:t>
-      </w:r>
-      <w:r>
-        <w:rPr>
-          <w:i w:val="0"/>
-        </w:rPr>
-        <w:t>. 2025;41(6):e70125. doi:10.1002/smi.70125</w:t>
-      </w:r>
-    </w:p>
-    <w:p>
-      <w:pPr>
-        <w:ind w:left="504" w:hanging="504"/>
-      </w:pPr>
-      <w:r>
-        <w:t>41.</w:t>
-        <w:tab/>
-      </w:r>
-      <w:r>
-        <w:rPr>
-          <w:i w:val="0"/>
-        </w:rPr>
-        <w:t xml:space="preserve">Agarwal AK, Gonzales R, Scott K, Merchant R. Investigating the feasibility of using a wearable device to measure physiologic health data in emergency nurses and residents: observational cohort study. </w:t>
-      </w:r>
-      <w:r>
-        <w:rPr>
-          <w:i/>
-        </w:rPr>
-        <w:t>JMIR Form Res</w:t>
-      </w:r>
-      <w:r>
-        <w:rPr>
-          <w:i w:val="0"/>
-        </w:rPr>
-        <w:t>. 2024;8:e51569. doi:10.2196/51569</w:t>
-      </w:r>
-    </w:p>
-    <w:p>
-      <w:pPr>
-        <w:ind w:left="504" w:hanging="504"/>
-      </w:pPr>
-      <w:r>
-        <w:t>42.</w:t>
-        <w:tab/>
-      </w:r>
-      <w:r>
-        <w:rPr>
-          <w:i w:val="0"/>
-        </w:rPr>
-        <w:t xml:space="preserve">Wilton AR, Sheffield K, Wilkes Q, et al. The Burnout PRedictiOn Using Wearable aNd ArtIficial IntelligEnce (BROWNIE) study: a decentralized digital health protocol to predict burnout in registered nurses. </w:t>
-      </w:r>
-      <w:r>
-        <w:rPr>
-          <w:i/>
-        </w:rPr>
-        <w:t>BMC Nurs</w:t>
-      </w:r>
-      <w:r>
-        <w:rPr>
-          <w:i w:val="0"/>
-        </w:rPr>
-        <w:t>. 2024;23(1):114. doi:10.1186/s12912-024-01711-8</w:t>
-      </w:r>
-    </w:p>
-    <w:p>
-      <w:pPr>
-        <w:ind w:left="504" w:hanging="504"/>
-      </w:pPr>
-      <w:r>
-        <w:t>43.</w:t>
-        <w:tab/>
-      </w:r>
-      <w:r>
-        <w:rPr>
-          <w:i w:val="0"/>
-        </w:rPr>
-        <w:t xml:space="preserve">Hirten RP, Suprun M, Danieletto M, et al. A machine learning approach to determine resilience utilizing wearable device data: analysis of an observational cohort. </w:t>
-      </w:r>
-      <w:r>
-        <w:rPr>
-          <w:i/>
-        </w:rPr>
-        <w:t>JAMIA Open</w:t>
-      </w:r>
-      <w:r>
-        <w:rPr>
-          <w:i w:val="0"/>
-        </w:rPr>
-        <w:t>. 2023;6(2):ooad029. doi:10.1093/jamiaopen/ooad029</w:t>
-      </w:r>
-    </w:p>
-    <w:p>
-      <w:pPr>
-        <w:ind w:left="504" w:hanging="504"/>
-      </w:pPr>
-      <w:r>
-        <w:t>44.</w:t>
-        <w:tab/>
-      </w:r>
-      <w:r>
-        <w:rPr>
-          <w:i w:val="0"/>
-        </w:rPr>
-        <w:t xml:space="preserve">Sagun S, DeCicco D, Badami V, et al. iSleepFirst: burnout, fatigue, and wearable-tracked sleep deprivation among residents staffing the medical intensive care unit. </w:t>
-      </w:r>
-      <w:r>
-        <w:rPr>
-          <w:i/>
-        </w:rPr>
-        <w:t>Sleep Breath</w:t>
-      </w:r>
-      <w:r>
-        <w:rPr>
-          <w:i w:val="0"/>
-        </w:rPr>
-        <w:t>. 2023;27(6):2491-2497. doi:10.1007/s11325-023-02839-8</w:t>
-      </w:r>
-    </w:p>
-    <w:p>
-      <w:pPr>
-        <w:ind w:left="504" w:hanging="504"/>
-      </w:pPr>
-      <w:r>
-        <w:t>45.</w:t>
-        <w:tab/>
-      </w:r>
-      <w:r>
-        <w:rPr>
-          <w:i w:val="0"/>
-        </w:rPr>
-        <w:t xml:space="preserve">Faust L, Feldman K, Mattingly SM, Hachen D, Chawla NV. Deviations from normal bedtimes are associated with short-term increases in resting heart rate. </w:t>
-      </w:r>
-      <w:r>
-        <w:rPr>
-          <w:i/>
-        </w:rPr>
-        <w:t>NPJ Digit Med</w:t>
-      </w:r>
-      <w:r>
-        <w:rPr>
-          <w:i w:val="0"/>
-        </w:rPr>
-        <w:t>. 2020;3:39. doi:10.1038/s41746-020-0250-6</w:t>
-      </w:r>
-    </w:p>
-    <w:p>
-      <w:pPr>
-        <w:ind w:left="504" w:hanging="504"/>
-      </w:pPr>
-      <w:r>
-        <w:t>46.</w:t>
-        <w:tab/>
-      </w:r>
-      <w:r>
-        <w:rPr>
-          <w:i w:val="0"/>
-        </w:rPr>
-        <w:t xml:space="preserve">Miller DJ, Sargent C, Roach GD. A validation of six wearable devices for estimating sleep, heart rate and heart rate variability in healthy adults. </w:t>
-      </w:r>
-      <w:r>
-        <w:rPr>
-          <w:i/>
-        </w:rPr>
-        <w:t>Sensors (Basel)</w:t>
-      </w:r>
-      <w:r>
-        <w:rPr>
-          <w:i w:val="0"/>
-        </w:rPr>
-        <w:t>. 2022;22(16):6317. doi:10.3390/s22166317</w:t>
-      </w:r>
-    </w:p>
-    <w:p>
-      <w:pPr>
-        <w:ind w:left="504" w:hanging="504"/>
-      </w:pPr>
-      <w:r>
-        <w:t>47.</w:t>
-        <w:tab/>
-      </w:r>
-      <w:r>
-        <w:rPr>
-          <w:i w:val="0"/>
-        </w:rPr>
-        <w:t xml:space="preserve">Chinoy ED, Cuellar JA, Huwa KE, et al. Performance of seven consumer sleep-tracking devices compared with polysomnography. </w:t>
-      </w:r>
-      <w:r>
-        <w:rPr>
-          <w:i/>
-        </w:rPr>
-        <w:t>Sleep</w:t>
-      </w:r>
-      <w:r>
-        <w:rPr>
-          <w:i w:val="0"/>
-        </w:rPr>
-        <w:t>. 2021;44(5):zsaa291. doi:10.1093/sleep/zsaa291</w:t>
-      </w:r>
-    </w:p>
-    <w:p>
-      <w:pPr>
-        <w:ind w:left="504" w:hanging="504"/>
-      </w:pPr>
-      <w:r>
-        <w:t>48.</w:t>
         <w:tab/>
       </w:r>
       <w:r>

</xml_diff>

<commit_message>
Add source for Apple Watch SDNN statement and tidy unsourced claims
Literature review now cites Hirten et al. 2021 (JMIR) for Apple Watch
reporting HRV as SDNN, and rewords two sentences so they no longer make
claims without a source. Study notes updated to match (41 references).

Co-Authored-By: Claude Opus 5.5 <noreply@anthropic.com>
Claude-Session: https://claude.ai/code/session_014QgqFT5Fkzz2mf4ivKRGXX
</commit_message>
<xml_diff>
--- a/downloads/Literature_Review_Burnout_Sleep_Recovery_Women.docx
+++ b/downloads/Literature_Review_Burnout_Sleep_Recovery_Women.docx
@@ -69,7 +69,7 @@
         <w:t>4</w:t>
       </w:r>
       <w:r>
-        <w:t xml:space="preserve"> Sleep and the body's capacity to recover overnight are plausible pathways linking chronic stress to poorer health, and both can now be measured passively every night with consumer wearable devices.</w:t>
+        <w:t xml:space="preserve"> In this review, I treat sleep and overnight physiological recovery as possible links between chronic stress and poorer health, because both can now be measured every night with consumer wearable devices.</w:t>
       </w:r>
     </w:p>
     <w:p>
@@ -1801,7 +1801,7 @@
     </w:p>
     <w:p>
       <w:r>
-        <w:t>Commercial recovery scores, such as WHOOP Recovery, Oura Readiness, and Garmin Body Battery, combine HRV, resting heart rate, and sleep using proprietary formulas that have not been published. In 66 surgeons, an HRV-based wearable recovery score was not associated with how demanding they rated each operation, although junior surgeons had higher scores than senior surgeons.</w:t>
+        <w:t>Commercial recovery scores, such as WHOOP Recovery, Oura Readiness, and Garmin Body Battery, summarize several measures, such as HRV, resting heart rate, and sleep, into a single daily value, and evidence on whether these scores reflect stress or burnout is limited. In 66 surgeons, an HRV-based wearable recovery score was not associated with how demanding they rated each operation, although junior surgeons had higher scores than senior surgeons.</w:t>
       </w:r>
       <w:r>
         <w:rPr>
@@ -1850,7 +1850,16 @@
         <w:t>40</w:t>
       </w:r>
       <w:r>
-        <w:t xml:space="preserve"> Apple Watch reports HRV as the standard deviation of normal-to-normal intervals (SDNN) rather than RMSSD, so its values cannot be pooled directly with those from other devices.</w:t>
+        <w:t xml:space="preserve"> Apple Watch reports HRV as the standard deviation of normal-to-normal intervals (SDNN) rather than RMSSD,</w:t>
+      </w:r>
+      <w:r>
+        <w:rPr>
+          <w:vertAlign w:val="superscript"/>
+        </w:rPr>
+        <w:t>41</w:t>
+      </w:r>
+      <w:r>
+        <w:t xml:space="preserve"> so its values cannot be pooled directly with those from devices that report RMSSD.</w:t>
       </w:r>
     </w:p>
     <w:p>
@@ -3199,6 +3208,33 @@
           <w:i w:val="0"/>
         </w:rPr>
         <w:t>. 2025;13(16):e70527. doi:10.14814/phy2.70527</w:t>
+      </w:r>
+    </w:p>
+    <w:p>
+      <w:pPr>
+        <w:ind w:left="504" w:hanging="504"/>
+      </w:pPr>
+      <w:r>
+        <w:t>41.</w:t>
+        <w:tab/>
+      </w:r>
+      <w:r>
+        <w:rPr>
+          <w:i w:val="0"/>
+        </w:rPr>
+        <w:t xml:space="preserve">Hirten RP, Danieletto M, Tomalin L, et al. Use of physiological data from a wearable device to identify SARS-CoV-2 infection and symptoms and predict COVID-19 diagnosis: observational study. </w:t>
+      </w:r>
+      <w:r>
+        <w:rPr>
+          <w:i/>
+        </w:rPr>
+        <w:t>J Med Internet Res</w:t>
+      </w:r>
+      <w:r>
+        <w:rPr>
+          <w:i w:val="0"/>
+        </w:rPr>
+        <w:t>. 2021;23(2):e26107. doi:10.2196/26107</w:t>
       </w:r>
     </w:p>
     <w:sectPr>

</xml_diff>